<commit_message>
docs(mercado,tecnico): Centro Histórico como ubicación, utilización 35 %, nómina con aportes y propinas, intro y cierre en cada tabla
- Microlocalización: Manga 6 en accesibilidad y parqueadero (6,71); gana Centro Histórico (6,76), decisión por la importancia de la ubicación; arriendo y textos actualizados en ambos documentos
- Capacidad utilizada 35 % → 65 % (2027-2031), con origen de datos y estimaciones
- Insumos con su uso entre paréntesis; sin referencias a la clase ni a formatos internos
- Personal: turnos, recargos dominical y nocturno, aportes de salud, pensión y ARL (empresa y trabajador), prestaciones y bote común de propinas
- Áreas del local sin medidas; conclusiones en párrafos; rayas reemplazadas por paréntesis
- Párrafo introductorio y de cierre para las 103 tablas

Co-Authored-By: Claude Opus 5.5 <noreply@anthropic.com>
Claude-Session: https://claude.ai/code/session_01DvLKNimVRrvQKw6BC5SVu6
</commit_message>
<xml_diff>
--- a/entregables_word/Taller_1_Estudio_de_Mercado_Kazegami.docx
+++ b/entregables_word/Taller_1_Estudio_de_Mercado_Kazegami.docx
@@ -220,7 +220,7 @@
         <w:t xml:space="preserve"> </w:t>
       </w:r>
       <w:r>
-        <w:t xml:space="preserve">de KAZEGAMI RESTAURANTE siguiendo la estructura del Taller No. 1 del Seminario Taller Creación de Empresas y el marco metodológico de la formulación y evaluación de proyectos (Miranda, 2005; Sapag Chain y Sapag Chain, 2014). El estudio combina</w:t>
+        <w:t xml:space="preserve">de KAZEGAMI RESTAURANTE con el marco metodológico de la formulación y evaluación de proyectos (Miranda, 2005; Sapag Chain y Sapag Chain, 2014). El estudio combina</w:t>
       </w:r>
       <w:r>
         <w:t xml:space="preserve"> </w:t>
@@ -236,7 +236,7 @@
         <w:t xml:space="preserve"> </w:t>
       </w:r>
       <w:r>
-        <w:t xml:space="preserve">—una encuesta de mercado aplicada a 106 personas entre el 23 y el 24 de octubre de 2026— con</w:t>
+        <w:t xml:space="preserve">(una encuesta de mercado aplicada a 106 personas entre el 23 y el 24 de octubre de 2026) con</w:t>
       </w:r>
       <w:r>
         <w:t xml:space="preserve"> </w:t>
@@ -480,7 +480,7 @@
               <w:rPr>
                 <w:sz w:val="18"/>
               </w:rPr>
-              <w:t xml:space="preserve">Encuesta Kazegami: 106 respuestas, 31 variables. Cifras exactas en el archivo datos/RESUMEN_ENCUESTA.md.</w:t>
+              <w:t xml:space="preserve">Encuesta Kazegami: 106 respuestas, 31 variables. Resumen del instrumento en el Anexo B.</w:t>
             </w:r>
           </w:p>
         </w:tc>
@@ -590,6 +590,14 @@
         </w:tc>
       </w:tr>
     </w:tbl>
+    <w:p>
+      <w:pPr>
+        <w:pStyle w:val="BodyText"/>
+      </w:pPr>
+      <w:r>
+        <w:t xml:space="preserve">Estas convenciones se aplican en todo el documento: las cifras están en pesos de 2026 y cada dato externo tiene su fuente, de modo que el lector puede distinguir en cualquier momento entre lo que está verificado y lo que es una estimación del equipo.</w:t>
+      </w:r>
+    </w:p>
     <w:bookmarkEnd w:id="20"/>
     <w:bookmarkStart w:id="21" w:name="nombre-del-proyecto"/>
     <w:p>
@@ -615,10 +623,7 @@
         <w:t xml:space="preserve"> </w:t>
       </w:r>
       <w:r>
-        <w:t xml:space="preserve">—</w:t>
-      </w:r>
-      <w:r>
-        <w:t xml:space="preserve"> </w:t>
+        <w:t xml:space="preserve">(</w:t>
       </w:r>
       <w:r>
         <w:rPr>
@@ -642,7 +647,7 @@
         <w:t xml:space="preserve">”</w:t>
       </w:r>
       <w:r>
-        <w:t xml:space="preserve">. El nombre une dos palabras japonesas:</w:t>
+        <w:t xml:space="preserve">). El nombre une dos palabras japonesas:</w:t>
       </w:r>
       <w:r>
         <w:t xml:space="preserve"> </w:t>
@@ -946,7 +951,7 @@
               <w:rPr>
                 <w:sz w:val="18"/>
               </w:rPr>
-              <w:t xml:space="preserve">Cartagena de Indias, barrio Manga (resultado de la microlocalización del Estudio Técnico)</w:t>
+              <w:t xml:space="preserve">Cartagena de Indias, Centro Histórico (resultado de la microlocalización del Estudio Técnico)</w:t>
             </w:r>
           </w:p>
         </w:tc>
@@ -1200,6 +1205,22 @@
           <w:sz w:val="16"/>
         </w:rPr>
         <w:t xml:space="preserve">Fuente: Modelo Canvas Kazegami y encuesta de mercado (n = 106).</w:t>
+      </w:r>
+    </w:p>
+    <w:p>
+      <w:pPr>
+        <w:pStyle w:val="BodyText"/>
+      </w:pPr>
+      <w:r>
+        <w:t xml:space="preserve">La ficha muestra que Kazegami es un proyecto de servicio con una propuesta clara: técnica japonesa con ingredientes locales, servida en el Centro Histórico de Cartagena. Las cifras de aceptación de la encuesta indican desde el inicio que existe interés del mercado, lo que justifica estudiar en detalle su demanda y su oferta.</w:t>
+      </w:r>
+    </w:p>
+    <w:p>
+      <w:pPr>
+        <w:pStyle w:val="BodyText"/>
+      </w:pPr>
+      <w:r>
+        <w:t xml:space="preserve">El Modelo Canvas resume en nueve bloques cómo Kazegami crea, entrega y captura valor. La tabla presenta la síntesis de cada bloque, que sirve de referencia para las decisiones de este estudio y del Estudio Técnico.</w:t>
       </w:r>
     </w:p>
     <w:p>
@@ -2523,7 +2544,22 @@
         </w:tc>
       </w:tr>
     </w:tbl>
-    <w:p/>
+    <w:p>
+      <w:pPr>
+        <w:pStyle w:val="BodyText"/>
+      </w:pPr>
+      <w:r>
+        <w:t xml:space="preserve">Cada objetivo del estudio tiene así un método y una fuente definidos. La encuesta aparece en casi todas las filas, lo que muestra que la información primaria es la base del análisis, complementada con fuentes oficiales para dimensionar el mercado completo.</w:t>
+      </w:r>
+    </w:p>
+    <w:p>
+      <w:pPr>
+        <w:pStyle w:val="BodyText"/>
+      </w:pPr>
+      <w:r>
+        <w:t xml:space="preserve">Además de los objetivos, es necesario delimitar el alcance del estudio: el territorio, el periodo, el producto y la unidad con la que se miden la demanda y la oferta.</w:t>
+      </w:r>
+    </w:p>
     <w:p>
       <w:pPr>
         <w:pStyle w:val="TableCaption"/>
@@ -2799,6 +2835,14 @@
         </w:tc>
       </w:tr>
     </w:tbl>
+    <w:p>
+      <w:pPr>
+        <w:pStyle w:val="BodyText"/>
+      </w:pPr>
+      <w:r>
+        <w:t xml:space="preserve">Medir la demanda y la oferta en platos servidos permite compararlas directamente y conectar el estudio de mercado con la capacidad del local que se calcula en el Estudio Técnico.</w:t>
+      </w:r>
+    </w:p>
     <w:bookmarkEnd w:id="23"/>
     <w:bookmarkEnd w:id="24"/>
     <w:bookmarkStart w:id="50" w:name="identificación-del-bien-o-servicio"/>
@@ -3475,7 +3519,7 @@
               <w:rPr>
                 <w:sz w:val="17"/>
               </w:rPr>
-              <w:t xml:space="preserve">—</w:t>
+              <w:t xml:space="preserve">-</w:t>
             </w:r>
           </w:p>
         </w:tc>
@@ -3547,7 +3591,7 @@
               <w:rPr>
                 <w:sz w:val="17"/>
               </w:rPr>
-              <w:t xml:space="preserve">—</w:t>
+              <w:t xml:space="preserve">-</w:t>
             </w:r>
           </w:p>
         </w:tc>
@@ -3586,7 +3630,7 @@
               <w:rPr>
                 <w:sz w:val="17"/>
               </w:rPr>
-              <w:t xml:space="preserve">—</w:t>
+              <w:t xml:space="preserve">-</w:t>
             </w:r>
           </w:p>
         </w:tc>
@@ -3650,7 +3694,7 @@
               <w:rPr>
                 <w:sz w:val="17"/>
               </w:rPr>
-              <w:t xml:space="preserve">—</w:t>
+              <w:t xml:space="preserve">-</w:t>
             </w:r>
           </w:p>
         </w:tc>
@@ -3689,7 +3733,7 @@
               <w:rPr>
                 <w:sz w:val="17"/>
               </w:rPr>
-              <w:t xml:space="preserve">—</w:t>
+              <w:t xml:space="preserve">-</w:t>
             </w:r>
           </w:p>
         </w:tc>
@@ -3761,7 +3805,7 @@
               <w:rPr>
                 <w:sz w:val="17"/>
               </w:rPr>
-              <w:t xml:space="preserve">—</w:t>
+              <w:t xml:space="preserve">-</w:t>
             </w:r>
           </w:p>
         </w:tc>
@@ -3800,7 +3844,7 @@
               <w:rPr>
                 <w:sz w:val="17"/>
               </w:rPr>
-              <w:t xml:space="preserve">—</w:t>
+              <w:t xml:space="preserve">-</w:t>
             </w:r>
           </w:p>
         </w:tc>
@@ -3864,7 +3908,7 @@
               <w:rPr>
                 <w:sz w:val="17"/>
               </w:rPr>
-              <w:t xml:space="preserve">—</w:t>
+              <w:t xml:space="preserve">-</w:t>
             </w:r>
           </w:p>
         </w:tc>
@@ -4375,6 +4419,14 @@
         <w:t xml:space="preserve">Fuente: Encuesta (pregunta de ocasión, n = 106) y Canvas.</w:t>
       </w:r>
     </w:p>
+    <w:p>
+      <w:pPr>
+        <w:pStyle w:val="BodyText"/>
+      </w:pPr>
+      <w:r>
+        <w:t xml:space="preserve">El uso de cada plato define cómo se arma la carta: el rollo para compartir en las salidas en grupo, el ramen como plato fuerte también al mediodía y la tempura como entrada. Como las ocasiones principales son las salidas con amigos y en pareja, el servicio debe estar pensado para grupos pequeños y para la noche.</w:t>
+      </w:r>
+    </w:p>
     <w:bookmarkEnd w:id="28"/>
     <w:bookmarkStart w:id="32" w:name="usuarios"/>
     <w:p>
@@ -4823,6 +4875,14 @@
           <w:sz w:val="16"/>
         </w:rPr>
         <w:t xml:space="preserve">Fuente: Encuesta (n = 106); Migración Colombia vía El Universal (2026); Canvas.</w:t>
+      </w:r>
+    </w:p>
+    <w:p>
+      <w:pPr>
+        <w:pStyle w:val="BodyText"/>
+      </w:pPr>
+      <w:r>
+        <w:t xml:space="preserve">Los cuatro segmentos tienen motivos de compra distintos, por lo que Kazegami necesita estrategias diferentes: precio justo y redes sociales para los jóvenes, calidad y atención para parejas y familias, visibilidad en el Centro Histórico y alianzas hoteleras para los turistas, y rapidez al mediodía para los ejecutivos.</w:t>
       </w:r>
     </w:p>
     <w:p>
@@ -5409,6 +5469,14 @@
         <w:t xml:space="preserve">Fuente: Encuesta (n = 106); Tripadvisor (oct. 2026); precios SIPSA-DANE y Global Gourmet Market (oct. 2026); recetas estándar del Estudio Técnico.</w:t>
       </w:r>
     </w:p>
+    <w:p>
+      <w:pPr>
+        <w:pStyle w:val="BodyText"/>
+      </w:pPr>
+      <w:r>
+        <w:t xml:space="preserve">En los tres productos el mayor costo es la proteína: el pescado y el langostino en el rollo, el langostino en la tempura y los insumos importados en el ramen. Comprar el pescado en Bazurto y preparar el caldo por lotes es lo que permite ofrecer porciones generosas a un precio menor que el de la competencia.</w:t>
+      </w:r>
+    </w:p>
     <w:bookmarkEnd w:id="33"/>
     <w:bookmarkStart w:id="34" w:name="composición"/>
     <w:p>
@@ -5453,7 +5521,7 @@
         <w:t xml:space="preserve">shari</w:t>
       </w:r>
       <w:r>
-        <w:t xml:space="preserve">), envuelto en una hoja de alga nori. El relleno combina pescado blanco fresco de la pesca artesanal del Caribe —pargo rojo comprado en el Mercado de Bazurto— con langostino, aguacate papelillo, pepino y un toque de mango de azúcar que le da identidad caribeña al rollo. Se completa con queso crema, ajonjolí y una salsa picante de la casa, y se acompaña con salsa de soya, wasabi y jengibre encurtido (</w:t>
+        <w:t xml:space="preserve">), envuelto en una hoja de alga nori. El relleno combina pescado blanco fresco de la pesca artesanal del Caribe (pargo rojo comprado en el Mercado de Bazurto) con langostino, aguacate papelillo, pepino y un toque de mango de azúcar que le da identidad caribeña al rollo. Se completa con queso crema, ajonjolí y una salsa picante de la casa, y se acompaña con salsa de soya, wasabi y jengibre encurtido (</w:t>
       </w:r>
       <w:r>
         <w:rPr>
@@ -5547,7 +5615,7 @@
         <w:t xml:space="preserve"> </w:t>
       </w:r>
       <w:r>
-        <w:t xml:space="preserve">se compone de cinco langostinos y una selección de vegetales de la región —berenjena, ahuyama y cebolla—, cubiertos con un batido muy ligero de harina para tempura, fécula de maíz, huevo y agua helada, y fritos en aceite vegetal. Se sirve con salsa</w:t>
+        <w:t xml:space="preserve">se compone de cinco langostinos y una selección de vegetales de la región (berenjena, ahuyama y cebolla), cubiertos con un batido muy ligero de harina para tempura, fécula de maíz, huevo y agua helada, y fritos en aceite vegetal. Se sirve con salsa</w:t>
       </w:r>
       <w:r>
         <w:t xml:space="preserve"> </w:t>
@@ -6586,7 +6654,7 @@
               <w:rPr>
                 <w:sz w:val="17"/>
               </w:rPr>
-              <w:t xml:space="preserve">—</w:t>
+              <w:t xml:space="preserve">-</w:t>
             </w:r>
           </w:p>
         </w:tc>
@@ -6671,7 +6739,7 @@
               <w:rPr>
                 <w:sz w:val="17"/>
               </w:rPr>
-              <w:t xml:space="preserve">—</w:t>
+              <w:t xml:space="preserve">-</w:t>
             </w:r>
           </w:p>
         </w:tc>
@@ -6928,7 +6996,7 @@
               <w:rPr>
                 <w:sz w:val="17"/>
               </w:rPr>
-              <w:t xml:space="preserve">—</w:t>
+              <w:t xml:space="preserve">-</w:t>
             </w:r>
           </w:p>
         </w:tc>
@@ -6966,6 +7034,14 @@
           <w:sz w:val="16"/>
         </w:rPr>
         <w:t xml:space="preserve">Fuente: Encuesta (n = 106); Rappi; dameramen.com; lacevicheriacartagena.com; Portafolio (2025).</w:t>
+      </w:r>
+    </w:p>
+    <w:p>
+      <w:pPr>
+        <w:pStyle w:val="BodyText"/>
+      </w:pPr>
+      <w:r>
+        <w:t xml:space="preserve">Los sustitutos directos cuestan más que los platos de Kazegami, lo que es una ventaja; pero los sustitutos lejanos, como la comida rápida y la típica, son los que el cliente elige con más frecuencia. Por eso la estrategia no consiste en competir con ellos en precio, sino en ofrecer una experiencia diferente.</w:t>
       </w:r>
     </w:p>
     <w:p>
@@ -7074,7 +7150,7 @@
         <w:pStyle w:val="FirstParagraph"/>
       </w:pPr>
       <w:r>
-        <w:t xml:space="preserve">Un bien complementario es aquel que se consume junto con los platos principales y que aumenta el valor de la visita. En un restaurante japonés los complementarios más importantes son las bebidas —té, cerveza y sake— y los postres, que además mejoran el ticket promedio. La encuesta los menciona de forma espontánea: en la pregunta abierta aparecen la cerveza Asahi y los postres. La tabla presenta los complementarios con su precio real en un restaurante japonés de la ciudad.</w:t>
+        <w:t xml:space="preserve">Un bien complementario es aquel que se consume junto con los platos principales y que aumenta el valor de la visita. En un restaurante japonés los complementarios más importantes son las bebidas (té, cerveza y sake) y los postres, que además mejoran el ticket promedio. La encuesta los menciona de forma espontánea: en la pregunta abierta aparecen la cerveza Asahi y los postres. La tabla presenta los complementarios con su precio real en un restaurante japonés de la ciudad.</w:t>
       </w:r>
     </w:p>
     <w:p>
@@ -7738,7 +7814,7 @@
               <w:rPr>
                 <w:sz w:val="17"/>
               </w:rPr>
-              <w:t xml:space="preserve">—</w:t>
+              <w:t xml:space="preserve">-</w:t>
             </w:r>
           </w:p>
         </w:tc>
@@ -7825,7 +7901,7 @@
               <w:rPr>
                 <w:sz w:val="17"/>
               </w:rPr>
-              <w:t xml:space="preserve">—</w:t>
+              <w:t xml:space="preserve">-</w:t>
             </w:r>
           </w:p>
         </w:tc>
@@ -7861,6 +7937,14 @@
           <w:sz w:val="16"/>
         </w:rPr>
         <w:t xml:space="preserve">Fuente: Encuesta (pregunta abierta); dameramen.com/menu.</w:t>
+      </w:r>
+    </w:p>
+    <w:p>
+      <w:pPr>
+        <w:pStyle w:val="BodyText"/>
+      </w:pPr>
+      <w:r>
+        <w:t xml:space="preserve">Las bebidas y los postres son los complementarios que más aportan al ticket promedio, y Kazegami los incluirá en su carta. Sus precios en el mercado, entre $7.000 y $16.000 por bebida, se tomaron como referencia para la carta de complementarios de la sección 6.</w:t>
       </w:r>
     </w:p>
     <w:bookmarkEnd w:id="41"/>
@@ -8276,6 +8360,14 @@
         </w:tc>
       </w:tr>
     </w:tbl>
+    <w:p>
+      <w:pPr>
+        <w:pStyle w:val="BodyText"/>
+      </w:pPr>
+      <w:r>
+        <w:t xml:space="preserve">Al ser un bien final, normal y de compra ocasional, la demanda de Kazegami depende del ingreso de los clientes y de las ocasiones de salida. Por eso el estudio usa la capacidad de pago y la frecuencia de consumo como filtros para estimar la demanda.</w:t>
+      </w:r>
+    </w:p>
     <w:bookmarkEnd w:id="42"/>
     <w:bookmarkStart w:id="43" w:name="sistemas-de-distribución"/>
     <w:p>
@@ -8652,6 +8744,14 @@
         <w:t xml:space="preserve">Fuente: Encuesta (medio de reserva) y Canvas.</w:t>
       </w:r>
     </w:p>
+    <w:p>
+      <w:pPr>
+        <w:pStyle w:val="BodyText"/>
+      </w:pPr>
+      <w:r>
+        <w:t xml:space="preserve">El canal directo le permite a Kazegami controlar la calidad del producto y la experiencia de principio a fin, y evita pagar comisiones a plataformas de domicilios. A cambio, todo el esfuerzo comercial se concentra en atraer al cliente hasta el local.</w:t>
+      </w:r>
+    </w:p>
     <w:bookmarkEnd w:id="43"/>
     <w:bookmarkStart w:id="44" w:name="bienes-y-servicios-del-sector-público"/>
     <w:p>
@@ -9176,6 +9276,14 @@
           <w:sz w:val="16"/>
         </w:rPr>
         <w:t xml:space="preserve">Fuente: Cartagena Cómo Vamos, Encuesta de Percepción Ciudadana 2023 (empresas de servicios públicos de Cartagena).</w:t>
+      </w:r>
+    </w:p>
+    <w:p>
+      <w:pPr>
+        <w:pStyle w:val="BodyText"/>
+      </w:pPr>
+      <w:r>
+        <w:t xml:space="preserve">La operación depende sobre todo de la energía y del gas: un corte de energía rompe la cadena de frío del pescado y sin gas no se puede cocinar el caldo ni freír la tempura. Por eso el Estudio Técnico incluye una planta eléctrica de respaldo y los costos de estos servicios dentro de la operación mensual.</w:t>
       </w:r>
     </w:p>
     <w:bookmarkEnd w:id="44"/>
@@ -12076,6 +12184,14 @@
         <w:pStyle w:val="BodyText"/>
       </w:pPr>
       <w:r>
+        <w:t xml:space="preserve">El pescado y el langostino son los insumos más caros por kilo, pero se compran a precios mayoristas en el mercado local; los insumos japoneses son importados, pero se usan en cantidades pequeñas por porción, por lo que su peso en el costo es moderado.</w:t>
+      </w:r>
+    </w:p>
+    <w:p>
+      <w:pPr>
+        <w:pStyle w:val="BodyText"/>
+      </w:pPr>
+      <w:r>
         <w:t xml:space="preserve">Con esos costos y la receta estándar de cada plato se calcula el costo por porción y se compara con el precio de mercado y con el precio propuesto para Kazegami.</w:t>
       </w:r>
     </w:p>
@@ -12435,55 +12551,55 @@
               <w:rPr>
                 <w:sz w:val="17"/>
               </w:rPr>
-              <w:t xml:space="preserve">$11.768</w:t>
-            </w:r>
-          </w:p>
-        </w:tc>
-        <w:tc>
-          <w:tcPr/>
-          <w:p>
-            <w:pPr>
-              <w:pStyle w:val="Compact"/>
-              <w:spacing w:after="0" w:before="0" w:line="240" w:lineRule="auto"/>
-              <w:jc w:val="right"/>
-            </w:pPr>
-            <w:r>
-              <w:rPr>
-                <w:sz w:val="17"/>
-              </w:rPr>
-              <w:t xml:space="preserve">$13.189</w:t>
-            </w:r>
-          </w:p>
-        </w:tc>
-        <w:tc>
-          <w:tcPr/>
-          <w:p>
-            <w:pPr>
-              <w:pStyle w:val="Compact"/>
-              <w:spacing w:after="0" w:before="0" w:line="240" w:lineRule="auto"/>
-              <w:jc w:val="right"/>
-            </w:pPr>
-            <w:r>
-              <w:rPr>
-                <w:sz w:val="17"/>
-              </w:rPr>
-              <w:t xml:space="preserve">$12.687</w:t>
-            </w:r>
-          </w:p>
-        </w:tc>
-        <w:tc>
-          <w:tcPr/>
-          <w:p>
-            <w:pPr>
-              <w:pStyle w:val="Compact"/>
-              <w:spacing w:after="0" w:before="0" w:line="240" w:lineRule="auto"/>
-              <w:jc w:val="left"/>
-            </w:pPr>
-            <w:r>
-              <w:rPr>
-                <w:sz w:val="17"/>
-              </w:rPr>
-              <w:t xml:space="preserve">Tablas formato Punto 6 (Estudio Técnico)</w:t>
+              <w:t xml:space="preserve">$12.060</w:t>
+            </w:r>
+          </w:p>
+        </w:tc>
+        <w:tc>
+          <w:tcPr/>
+          <w:p>
+            <w:pPr>
+              <w:pStyle w:val="Compact"/>
+              <w:spacing w:after="0" w:before="0" w:line="240" w:lineRule="auto"/>
+              <w:jc w:val="right"/>
+            </w:pPr>
+            <w:r>
+              <w:rPr>
+                <w:sz w:val="17"/>
+              </w:rPr>
+              <w:t xml:space="preserve">$13.648</w:t>
+            </w:r>
+          </w:p>
+        </w:tc>
+        <w:tc>
+          <w:tcPr/>
+          <w:p>
+            <w:pPr>
+              <w:pStyle w:val="Compact"/>
+              <w:spacing w:after="0" w:before="0" w:line="240" w:lineRule="auto"/>
+              <w:jc w:val="right"/>
+            </w:pPr>
+            <w:r>
+              <w:rPr>
+                <w:sz w:val="17"/>
+              </w:rPr>
+              <w:t xml:space="preserve">$13.002</w:t>
+            </w:r>
+          </w:p>
+        </w:tc>
+        <w:tc>
+          <w:tcPr/>
+          <w:p>
+            <w:pPr>
+              <w:pStyle w:val="Compact"/>
+              <w:spacing w:after="0" w:before="0" w:line="240" w:lineRule="auto"/>
+              <w:jc w:val="left"/>
+            </w:pPr>
+            <w:r>
+              <w:rPr>
+                <w:sz w:val="17"/>
+              </w:rPr>
+              <w:t xml:space="preserve">Tablas de insumos y costos (Estudio Técnico, sección 6)</w:t>
             </w:r>
           </w:p>
         </w:tc>
@@ -12892,43 +13008,43 @@
               <w:rPr>
                 <w:sz w:val="17"/>
               </w:rPr>
-              <w:t xml:space="preserve">$25.269</w:t>
-            </w:r>
-          </w:p>
-        </w:tc>
-        <w:tc>
-          <w:tcPr>
-            <w:shd w:val="clear" w:color="auto" w:fill="F5F7FB"/>
-          </w:tcPr>
-          <w:p>
-            <w:pPr>
-              <w:pStyle w:val="Compact"/>
-              <w:spacing w:after="0" w:before="0" w:line="240" w:lineRule="auto"/>
-              <w:jc w:val="right"/>
-            </w:pPr>
-            <w:r>
-              <w:rPr>
-                <w:sz w:val="17"/>
-              </w:rPr>
-              <w:t xml:space="preserve">$21.996</w:t>
-            </w:r>
-          </w:p>
-        </w:tc>
-        <w:tc>
-          <w:tcPr>
-            <w:shd w:val="clear" w:color="auto" w:fill="F5F7FB"/>
-          </w:tcPr>
-          <w:p>
-            <w:pPr>
-              <w:pStyle w:val="Compact"/>
-              <w:spacing w:after="0" w:before="0" w:line="240" w:lineRule="auto"/>
-              <w:jc w:val="right"/>
-            </w:pPr>
-            <w:r>
-              <w:rPr>
-                <w:sz w:val="17"/>
-              </w:rPr>
-              <w:t xml:space="preserve">$22.498</w:t>
+              <w:t xml:space="preserve">$24.977</w:t>
+            </w:r>
+          </w:p>
+        </w:tc>
+        <w:tc>
+          <w:tcPr>
+            <w:shd w:val="clear" w:color="auto" w:fill="F5F7FB"/>
+          </w:tcPr>
+          <w:p>
+            <w:pPr>
+              <w:pStyle w:val="Compact"/>
+              <w:spacing w:after="0" w:before="0" w:line="240" w:lineRule="auto"/>
+              <w:jc w:val="right"/>
+            </w:pPr>
+            <w:r>
+              <w:rPr>
+                <w:sz w:val="17"/>
+              </w:rPr>
+              <w:t xml:space="preserve">$21.537</w:t>
+            </w:r>
+          </w:p>
+        </w:tc>
+        <w:tc>
+          <w:tcPr>
+            <w:shd w:val="clear" w:color="auto" w:fill="F5F7FB"/>
+          </w:tcPr>
+          <w:p>
+            <w:pPr>
+              <w:pStyle w:val="Compact"/>
+              <w:spacing w:after="0" w:before="0" w:line="240" w:lineRule="auto"/>
+              <w:jc w:val="right"/>
+            </w:pPr>
+            <w:r>
+              <w:rPr>
+                <w:sz w:val="17"/>
+              </w:rPr>
+              <w:t xml:space="preserve">$22.183</w:t>
             </w:r>
           </w:p>
         </w:tc>
@@ -12966,6 +13082,14 @@
           <w:sz w:val="16"/>
         </w:rPr>
         <w:t xml:space="preserve">Fuente: Rappi; dameramen.com; SIPSA-DANE; Global Gourmet Market; Estatuto Tributario; Rivers (s.f.).</w:t>
+      </w:r>
+    </w:p>
+    <w:p>
+      <w:pPr>
+        <w:pStyle w:val="BodyText"/>
+      </w:pPr>
+      <w:r>
+        <w:t xml:space="preserve">Los tres platos dejan un margen de contribución de al menos $21.537 por unidad y un food cost dentro del rango de 28 % a 35 %, aun con precios inferiores a los del mercado. Esto confirma que el precio justo que pide la encuesta es compatible con un negocio rentable.</w:t>
       </w:r>
     </w:p>
     <w:p>
@@ -13572,7 +13696,7 @@
               <w:rPr>
                 <w:sz w:val="18"/>
               </w:rPr>
-              <w:t xml:space="preserve">Certificado de uso del suelo en Manga (fuera del área patrimonial)</w:t>
+              <w:t xml:space="preserve">Certificado de uso del suelo en el Centro Histórico; local que ya haya operado como restaurante</w:t>
             </w:r>
           </w:p>
         </w:tc>
@@ -13595,61 +13719,61 @@
               <w:rPr>
                 <w:sz w:val="18"/>
               </w:rPr>
-              <w:t xml:space="preserve">Código de Comercio y Ley 1258 de 2008</w:t>
-            </w:r>
-          </w:p>
-        </w:tc>
-        <w:tc>
-          <w:tcPr>
-            <w:shd w:val="clear" w:color="auto" w:fill="F5F7FB"/>
-          </w:tcPr>
-          <w:p>
-            <w:pPr>
-              <w:pStyle w:val="Compact"/>
-              <w:spacing w:after="0" w:before="0" w:line="240" w:lineRule="auto"/>
-              <w:jc w:val="left"/>
-            </w:pPr>
-            <w:r>
-              <w:rPr>
-                <w:sz w:val="18"/>
-              </w:rPr>
-              <w:t xml:space="preserve">Cámara de Comercio de Cartagena</w:t>
-            </w:r>
-          </w:p>
-        </w:tc>
-        <w:tc>
-          <w:tcPr>
-            <w:shd w:val="clear" w:color="auto" w:fill="F5F7FB"/>
-          </w:tcPr>
-          <w:p>
-            <w:pPr>
-              <w:pStyle w:val="Compact"/>
-              <w:spacing w:after="0" w:before="0" w:line="240" w:lineRule="auto"/>
-              <w:jc w:val="left"/>
-            </w:pPr>
-            <w:r>
-              <w:rPr>
-                <w:sz w:val="18"/>
-              </w:rPr>
-              <w:t xml:space="preserve">Registro mercantil y constitución de la S.A.S.</w:t>
-            </w:r>
-          </w:p>
-        </w:tc>
-        <w:tc>
-          <w:tcPr>
-            <w:shd w:val="clear" w:color="auto" w:fill="F5F7FB"/>
-          </w:tcPr>
-          <w:p>
-            <w:pPr>
-              <w:pStyle w:val="Compact"/>
-              <w:spacing w:after="0" w:before="0" w:line="240" w:lineRule="auto"/>
-              <w:jc w:val="left"/>
-            </w:pPr>
-            <w:r>
-              <w:rPr>
-                <w:sz w:val="18"/>
-              </w:rPr>
-              <w:t xml:space="preserve">Matrícula mercantil anual</w:t>
+              <w:t xml:space="preserve">Ley 1185 de 2008 (patrimonio cultural)</w:t>
+            </w:r>
+          </w:p>
+        </w:tc>
+        <w:tc>
+          <w:tcPr>
+            <w:shd w:val="clear" w:color="auto" w:fill="F5F7FB"/>
+          </w:tcPr>
+          <w:p>
+            <w:pPr>
+              <w:pStyle w:val="Compact"/>
+              <w:spacing w:after="0" w:before="0" w:line="240" w:lineRule="auto"/>
+              <w:jc w:val="left"/>
+            </w:pPr>
+            <w:r>
+              <w:rPr>
+                <w:sz w:val="18"/>
+              </w:rPr>
+              <w:t xml:space="preserve">Instituto de Patrimonio y Cultura de Cartagena (IPCC), ente gestor del PEMP</w:t>
+            </w:r>
+          </w:p>
+        </w:tc>
+        <w:tc>
+          <w:tcPr>
+            <w:shd w:val="clear" w:color="auto" w:fill="F5F7FB"/>
+          </w:tcPr>
+          <w:p>
+            <w:pPr>
+              <w:pStyle w:val="Compact"/>
+              <w:spacing w:after="0" w:before="0" w:line="240" w:lineRule="auto"/>
+              <w:jc w:val="left"/>
+            </w:pPr>
+            <w:r>
+              <w:rPr>
+                <w:sz w:val="18"/>
+              </w:rPr>
+              <w:t xml:space="preserve">Autorización previa para intervenir inmuebles del Centro Histórico</w:t>
+            </w:r>
+          </w:p>
+        </w:tc>
+        <w:tc>
+          <w:tcPr>
+            <w:shd w:val="clear" w:color="auto" w:fill="F5F7FB"/>
+          </w:tcPr>
+          <w:p>
+            <w:pPr>
+              <w:pStyle w:val="Compact"/>
+              <w:spacing w:after="0" w:before="0" w:line="240" w:lineRule="auto"/>
+              <w:jc w:val="left"/>
+            </w:pPr>
+            <w:r>
+              <w:rPr>
+                <w:sz w:val="18"/>
+              </w:rPr>
+              <w:t xml:space="preserve">Trámite de cualquier adecuación del local (cocina, extracción, avisos)</w:t>
             </w:r>
           </w:p>
         </w:tc>
@@ -13670,55 +13794,55 @@
               <w:rPr>
                 <w:sz w:val="18"/>
               </w:rPr>
-              <w:t xml:space="preserve">Estatuto Tributario: RUT, facturación electrónica e impuesto nacional al consumo del 8 % (art. 512-1)</w:t>
-            </w:r>
-          </w:p>
-        </w:tc>
-        <w:tc>
-          <w:tcPr/>
-          <w:p>
-            <w:pPr>
-              <w:pStyle w:val="Compact"/>
-              <w:spacing w:after="0" w:before="0" w:line="240" w:lineRule="auto"/>
-              <w:jc w:val="left"/>
-            </w:pPr>
-            <w:r>
-              <w:rPr>
-                <w:sz w:val="18"/>
-              </w:rPr>
-              <w:t xml:space="preserve">DIAN</w:t>
-            </w:r>
-          </w:p>
-        </w:tc>
-        <w:tc>
-          <w:tcPr/>
-          <w:p>
-            <w:pPr>
-              <w:pStyle w:val="Compact"/>
-              <w:spacing w:after="0" w:before="0" w:line="240" w:lineRule="auto"/>
-              <w:jc w:val="left"/>
-            </w:pPr>
-            <w:r>
-              <w:rPr>
-                <w:sz w:val="18"/>
-              </w:rPr>
-              <w:t xml:space="preserve">Inscripción, factura electrónica y declaración bimestral de impoconsumo</w:t>
-            </w:r>
-          </w:p>
-        </w:tc>
-        <w:tc>
-          <w:tcPr/>
-          <w:p>
-            <w:pPr>
-              <w:pStyle w:val="Compact"/>
-              <w:spacing w:after="0" w:before="0" w:line="240" w:lineRule="auto"/>
-              <w:jc w:val="left"/>
-            </w:pPr>
-            <w:r>
-              <w:rPr>
-                <w:sz w:val="18"/>
-              </w:rPr>
-              <w:t xml:space="preserve">Software POS con facturación electrónica; precios con impoconsumo incluido</w:t>
+              <w:t xml:space="preserve">Código de Comercio y Ley 1258 de 2008</w:t>
+            </w:r>
+          </w:p>
+        </w:tc>
+        <w:tc>
+          <w:tcPr/>
+          <w:p>
+            <w:pPr>
+              <w:pStyle w:val="Compact"/>
+              <w:spacing w:after="0" w:before="0" w:line="240" w:lineRule="auto"/>
+              <w:jc w:val="left"/>
+            </w:pPr>
+            <w:r>
+              <w:rPr>
+                <w:sz w:val="18"/>
+              </w:rPr>
+              <w:t xml:space="preserve">Cámara de Comercio de Cartagena</w:t>
+            </w:r>
+          </w:p>
+        </w:tc>
+        <w:tc>
+          <w:tcPr/>
+          <w:p>
+            <w:pPr>
+              <w:pStyle w:val="Compact"/>
+              <w:spacing w:after="0" w:before="0" w:line="240" w:lineRule="auto"/>
+              <w:jc w:val="left"/>
+            </w:pPr>
+            <w:r>
+              <w:rPr>
+                <w:sz w:val="18"/>
+              </w:rPr>
+              <w:t xml:space="preserve">Registro mercantil y constitución de la S.A.S.</w:t>
+            </w:r>
+          </w:p>
+        </w:tc>
+        <w:tc>
+          <w:tcPr/>
+          <w:p>
+            <w:pPr>
+              <w:pStyle w:val="Compact"/>
+              <w:spacing w:after="0" w:before="0" w:line="240" w:lineRule="auto"/>
+              <w:jc w:val="left"/>
+            </w:pPr>
+            <w:r>
+              <w:rPr>
+                <w:sz w:val="18"/>
+              </w:rPr>
+              <w:t xml:space="preserve">Matrícula mercantil anual</w:t>
             </w:r>
           </w:p>
         </w:tc>
@@ -13741,61 +13865,61 @@
               <w:rPr>
                 <w:sz w:val="18"/>
               </w:rPr>
-              <w:t xml:space="preserve">Impuesto de Industria y Comercio (ICA)</w:t>
-            </w:r>
-          </w:p>
-        </w:tc>
-        <w:tc>
-          <w:tcPr>
-            <w:shd w:val="clear" w:color="auto" w:fill="F5F7FB"/>
-          </w:tcPr>
-          <w:p>
-            <w:pPr>
-              <w:pStyle w:val="Compact"/>
-              <w:spacing w:after="0" w:before="0" w:line="240" w:lineRule="auto"/>
-              <w:jc w:val="left"/>
-            </w:pPr>
-            <w:r>
-              <w:rPr>
-                <w:sz w:val="18"/>
-              </w:rPr>
-              <w:t xml:space="preserve">Secretaría de Hacienda Distrital</w:t>
-            </w:r>
-          </w:p>
-        </w:tc>
-        <w:tc>
-          <w:tcPr>
-            <w:shd w:val="clear" w:color="auto" w:fill="F5F7FB"/>
-          </w:tcPr>
-          <w:p>
-            <w:pPr>
-              <w:pStyle w:val="Compact"/>
-              <w:spacing w:after="0" w:before="0" w:line="240" w:lineRule="auto"/>
-              <w:jc w:val="left"/>
-            </w:pPr>
-            <w:r>
-              <w:rPr>
-                <w:sz w:val="18"/>
-              </w:rPr>
-              <w:t xml:space="preserve">Registro y declaración</w:t>
-            </w:r>
-          </w:p>
-        </w:tc>
-        <w:tc>
-          <w:tcPr>
-            <w:shd w:val="clear" w:color="auto" w:fill="F5F7FB"/>
-          </w:tcPr>
-          <w:p>
-            <w:pPr>
-              <w:pStyle w:val="Compact"/>
-              <w:spacing w:after="0" w:before="0" w:line="240" w:lineRule="auto"/>
-              <w:jc w:val="left"/>
-            </w:pPr>
-            <w:r>
-              <w:rPr>
-                <w:sz w:val="18"/>
-              </w:rPr>
-              <w:t xml:space="preserve">Tarifa del Distrito para restaurantes</w:t>
+              <w:t xml:space="preserve">Estatuto Tributario: RUT, facturación electrónica e impuesto nacional al consumo del 8 % (art. 512-1)</w:t>
+            </w:r>
+          </w:p>
+        </w:tc>
+        <w:tc>
+          <w:tcPr>
+            <w:shd w:val="clear" w:color="auto" w:fill="F5F7FB"/>
+          </w:tcPr>
+          <w:p>
+            <w:pPr>
+              <w:pStyle w:val="Compact"/>
+              <w:spacing w:after="0" w:before="0" w:line="240" w:lineRule="auto"/>
+              <w:jc w:val="left"/>
+            </w:pPr>
+            <w:r>
+              <w:rPr>
+                <w:sz w:val="18"/>
+              </w:rPr>
+              <w:t xml:space="preserve">DIAN</w:t>
+            </w:r>
+          </w:p>
+        </w:tc>
+        <w:tc>
+          <w:tcPr>
+            <w:shd w:val="clear" w:color="auto" w:fill="F5F7FB"/>
+          </w:tcPr>
+          <w:p>
+            <w:pPr>
+              <w:pStyle w:val="Compact"/>
+              <w:spacing w:after="0" w:before="0" w:line="240" w:lineRule="auto"/>
+              <w:jc w:val="left"/>
+            </w:pPr>
+            <w:r>
+              <w:rPr>
+                <w:sz w:val="18"/>
+              </w:rPr>
+              <w:t xml:space="preserve">Inscripción, factura electrónica y declaración bimestral de impoconsumo</w:t>
+            </w:r>
+          </w:p>
+        </w:tc>
+        <w:tc>
+          <w:tcPr>
+            <w:shd w:val="clear" w:color="auto" w:fill="F5F7FB"/>
+          </w:tcPr>
+          <w:p>
+            <w:pPr>
+              <w:pStyle w:val="Compact"/>
+              <w:spacing w:after="0" w:before="0" w:line="240" w:lineRule="auto"/>
+              <w:jc w:val="left"/>
+            </w:pPr>
+            <w:r>
+              <w:rPr>
+                <w:sz w:val="18"/>
+              </w:rPr>
+              <w:t xml:space="preserve">Software POS con facturación electrónica; precios con impoconsumo incluido</w:t>
             </w:r>
           </w:p>
         </w:tc>
@@ -13816,55 +13940,55 @@
               <w:rPr>
                 <w:sz w:val="18"/>
               </w:rPr>
-              <w:t xml:space="preserve">Ley 1801 de 2016 (Código de Policía), art. 87</w:t>
-            </w:r>
-          </w:p>
-        </w:tc>
-        <w:tc>
-          <w:tcPr/>
-          <w:p>
-            <w:pPr>
-              <w:pStyle w:val="Compact"/>
-              <w:spacing w:after="0" w:before="0" w:line="240" w:lineRule="auto"/>
-              <w:jc w:val="left"/>
-            </w:pPr>
-            <w:r>
-              <w:rPr>
-                <w:sz w:val="18"/>
-              </w:rPr>
-              <w:t xml:space="preserve">Alcaldía / Policía</w:t>
-            </w:r>
-          </w:p>
-        </w:tc>
-        <w:tc>
-          <w:tcPr/>
-          <w:p>
-            <w:pPr>
-              <w:pStyle w:val="Compact"/>
-              <w:spacing w:after="0" w:before="0" w:line="240" w:lineRule="auto"/>
-              <w:jc w:val="left"/>
-            </w:pPr>
-            <w:r>
-              <w:rPr>
-                <w:sz w:val="18"/>
-              </w:rPr>
-              <w:t xml:space="preserve">Requisitos de funcionamiento: uso del suelo, condiciones sanitarias, derechos de autor</w:t>
-            </w:r>
-          </w:p>
-        </w:tc>
-        <w:tc>
-          <w:tcPr/>
-          <w:p>
-            <w:pPr>
-              <w:pStyle w:val="Compact"/>
-              <w:spacing w:after="0" w:before="0" w:line="240" w:lineRule="auto"/>
-              <w:jc w:val="left"/>
-            </w:pPr>
-            <w:r>
-              <w:rPr>
-                <w:sz w:val="18"/>
-              </w:rPr>
-              <w:t xml:space="preserve">Tener los documentos disponibles en el local</w:t>
+              <w:t xml:space="preserve">Impuesto de Industria y Comercio (ICA)</w:t>
+            </w:r>
+          </w:p>
+        </w:tc>
+        <w:tc>
+          <w:tcPr/>
+          <w:p>
+            <w:pPr>
+              <w:pStyle w:val="Compact"/>
+              <w:spacing w:after="0" w:before="0" w:line="240" w:lineRule="auto"/>
+              <w:jc w:val="left"/>
+            </w:pPr>
+            <w:r>
+              <w:rPr>
+                <w:sz w:val="18"/>
+              </w:rPr>
+              <w:t xml:space="preserve">Secretaría de Hacienda Distrital</w:t>
+            </w:r>
+          </w:p>
+        </w:tc>
+        <w:tc>
+          <w:tcPr/>
+          <w:p>
+            <w:pPr>
+              <w:pStyle w:val="Compact"/>
+              <w:spacing w:after="0" w:before="0" w:line="240" w:lineRule="auto"/>
+              <w:jc w:val="left"/>
+            </w:pPr>
+            <w:r>
+              <w:rPr>
+                <w:sz w:val="18"/>
+              </w:rPr>
+              <w:t xml:space="preserve">Registro y declaración</w:t>
+            </w:r>
+          </w:p>
+        </w:tc>
+        <w:tc>
+          <w:tcPr/>
+          <w:p>
+            <w:pPr>
+              <w:pStyle w:val="Compact"/>
+              <w:spacing w:after="0" w:before="0" w:line="240" w:lineRule="auto"/>
+              <w:jc w:val="left"/>
+            </w:pPr>
+            <w:r>
+              <w:rPr>
+                <w:sz w:val="18"/>
+              </w:rPr>
+              <w:t xml:space="preserve">Tarifa del Distrito para restaurantes</w:t>
             </w:r>
           </w:p>
         </w:tc>
@@ -13887,61 +14011,61 @@
               <w:rPr>
                 <w:sz w:val="18"/>
               </w:rPr>
-              <w:t xml:space="preserve">Ley 23 de 1982 (derechos de autor)</w:t>
-            </w:r>
-          </w:p>
-        </w:tc>
-        <w:tc>
-          <w:tcPr>
-            <w:shd w:val="clear" w:color="auto" w:fill="F5F7FB"/>
-          </w:tcPr>
-          <w:p>
-            <w:pPr>
-              <w:pStyle w:val="Compact"/>
-              <w:spacing w:after="0" w:before="0" w:line="240" w:lineRule="auto"/>
-              <w:jc w:val="left"/>
-            </w:pPr>
-            <w:r>
-              <w:rPr>
-                <w:sz w:val="18"/>
-              </w:rPr>
-              <w:t xml:space="preserve">Sayco - Acinpro (OSA)</w:t>
-            </w:r>
-          </w:p>
-        </w:tc>
-        <w:tc>
-          <w:tcPr>
-            <w:shd w:val="clear" w:color="auto" w:fill="F5F7FB"/>
-          </w:tcPr>
-          <w:p>
-            <w:pPr>
-              <w:pStyle w:val="Compact"/>
-              <w:spacing w:after="0" w:before="0" w:line="240" w:lineRule="auto"/>
-              <w:jc w:val="left"/>
-            </w:pPr>
-            <w:r>
-              <w:rPr>
-                <w:sz w:val="18"/>
-              </w:rPr>
-              <w:t xml:space="preserve">Licencia por música ambiental</w:t>
-            </w:r>
-          </w:p>
-        </w:tc>
-        <w:tc>
-          <w:tcPr>
-            <w:shd w:val="clear" w:color="auto" w:fill="F5F7FB"/>
-          </w:tcPr>
-          <w:p>
-            <w:pPr>
-              <w:pStyle w:val="Compact"/>
-              <w:spacing w:after="0" w:before="0" w:line="240" w:lineRule="auto"/>
-              <w:jc w:val="left"/>
-            </w:pPr>
-            <w:r>
-              <w:rPr>
-                <w:sz w:val="18"/>
-              </w:rPr>
-              <w:t xml:space="preserve">Pago anual de la licencia</w:t>
+              <w:t xml:space="preserve">Ley 1801 de 2016 (Código de Policía), art. 87</w:t>
+            </w:r>
+          </w:p>
+        </w:tc>
+        <w:tc>
+          <w:tcPr>
+            <w:shd w:val="clear" w:color="auto" w:fill="F5F7FB"/>
+          </w:tcPr>
+          <w:p>
+            <w:pPr>
+              <w:pStyle w:val="Compact"/>
+              <w:spacing w:after="0" w:before="0" w:line="240" w:lineRule="auto"/>
+              <w:jc w:val="left"/>
+            </w:pPr>
+            <w:r>
+              <w:rPr>
+                <w:sz w:val="18"/>
+              </w:rPr>
+              <w:t xml:space="preserve">Alcaldía / Policía</w:t>
+            </w:r>
+          </w:p>
+        </w:tc>
+        <w:tc>
+          <w:tcPr>
+            <w:shd w:val="clear" w:color="auto" w:fill="F5F7FB"/>
+          </w:tcPr>
+          <w:p>
+            <w:pPr>
+              <w:pStyle w:val="Compact"/>
+              <w:spacing w:after="0" w:before="0" w:line="240" w:lineRule="auto"/>
+              <w:jc w:val="left"/>
+            </w:pPr>
+            <w:r>
+              <w:rPr>
+                <w:sz w:val="18"/>
+              </w:rPr>
+              <w:t xml:space="preserve">Requisitos de funcionamiento: uso del suelo, condiciones sanitarias, derechos de autor</w:t>
+            </w:r>
+          </w:p>
+        </w:tc>
+        <w:tc>
+          <w:tcPr>
+            <w:shd w:val="clear" w:color="auto" w:fill="F5F7FB"/>
+          </w:tcPr>
+          <w:p>
+            <w:pPr>
+              <w:pStyle w:val="Compact"/>
+              <w:spacing w:after="0" w:before="0" w:line="240" w:lineRule="auto"/>
+              <w:jc w:val="left"/>
+            </w:pPr>
+            <w:r>
+              <w:rPr>
+                <w:sz w:val="18"/>
+              </w:rPr>
+              <w:t xml:space="preserve">Tener los documentos disponibles en el local</w:t>
             </w:r>
           </w:p>
         </w:tc>
@@ -13962,55 +14086,55 @@
               <w:rPr>
                 <w:sz w:val="18"/>
               </w:rPr>
-              <w:t xml:space="preserve">Ley 1575 de 2012</w:t>
-            </w:r>
-          </w:p>
-        </w:tc>
-        <w:tc>
-          <w:tcPr/>
-          <w:p>
-            <w:pPr>
-              <w:pStyle w:val="Compact"/>
-              <w:spacing w:after="0" w:before="0" w:line="240" w:lineRule="auto"/>
-              <w:jc w:val="left"/>
-            </w:pPr>
-            <w:r>
-              <w:rPr>
-                <w:sz w:val="18"/>
-              </w:rPr>
-              <w:t xml:space="preserve">Cuerpo de Bomberos de Cartagena</w:t>
-            </w:r>
-          </w:p>
-        </w:tc>
-        <w:tc>
-          <w:tcPr/>
-          <w:p>
-            <w:pPr>
-              <w:pStyle w:val="Compact"/>
-              <w:spacing w:after="0" w:before="0" w:line="240" w:lineRule="auto"/>
-              <w:jc w:val="left"/>
-            </w:pPr>
-            <w:r>
-              <w:rPr>
-                <w:sz w:val="18"/>
-              </w:rPr>
-              <w:t xml:space="preserve">Certificado de seguridad humana y contra incendios</w:t>
-            </w:r>
-          </w:p>
-        </w:tc>
-        <w:tc>
-          <w:tcPr/>
-          <w:p>
-            <w:pPr>
-              <w:pStyle w:val="Compact"/>
-              <w:spacing w:after="0" w:before="0" w:line="240" w:lineRule="auto"/>
-              <w:jc w:val="left"/>
-            </w:pPr>
-            <w:r>
-              <w:rPr>
-                <w:sz w:val="18"/>
-              </w:rPr>
-              <w:t xml:space="preserve">Extintores, señalización y salidas de emergencia</w:t>
+              <w:t xml:space="preserve">Ley 23 de 1982 (derechos de autor)</w:t>
+            </w:r>
+          </w:p>
+        </w:tc>
+        <w:tc>
+          <w:tcPr/>
+          <w:p>
+            <w:pPr>
+              <w:pStyle w:val="Compact"/>
+              <w:spacing w:after="0" w:before="0" w:line="240" w:lineRule="auto"/>
+              <w:jc w:val="left"/>
+            </w:pPr>
+            <w:r>
+              <w:rPr>
+                <w:sz w:val="18"/>
+              </w:rPr>
+              <w:t xml:space="preserve">Sayco - Acinpro (OSA)</w:t>
+            </w:r>
+          </w:p>
+        </w:tc>
+        <w:tc>
+          <w:tcPr/>
+          <w:p>
+            <w:pPr>
+              <w:pStyle w:val="Compact"/>
+              <w:spacing w:after="0" w:before="0" w:line="240" w:lineRule="auto"/>
+              <w:jc w:val="left"/>
+            </w:pPr>
+            <w:r>
+              <w:rPr>
+                <w:sz w:val="18"/>
+              </w:rPr>
+              <w:t xml:space="preserve">Licencia por música ambiental</w:t>
+            </w:r>
+          </w:p>
+        </w:tc>
+        <w:tc>
+          <w:tcPr/>
+          <w:p>
+            <w:pPr>
+              <w:pStyle w:val="Compact"/>
+              <w:spacing w:after="0" w:before="0" w:line="240" w:lineRule="auto"/>
+              <w:jc w:val="left"/>
+            </w:pPr>
+            <w:r>
+              <w:rPr>
+                <w:sz w:val="18"/>
+              </w:rPr>
+              <w:t xml:space="preserve">Pago anual de la licencia</w:t>
             </w:r>
           </w:p>
         </w:tc>
@@ -14033,61 +14157,61 @@
               <w:rPr>
                 <w:sz w:val="18"/>
               </w:rPr>
-              <w:t xml:space="preserve">Ley 1480 de 2011 (Estatuto del Consumidor)</w:t>
-            </w:r>
-          </w:p>
-        </w:tc>
-        <w:tc>
-          <w:tcPr>
-            <w:shd w:val="clear" w:color="auto" w:fill="F5F7FB"/>
-          </w:tcPr>
-          <w:p>
-            <w:pPr>
-              <w:pStyle w:val="Compact"/>
-              <w:spacing w:after="0" w:before="0" w:line="240" w:lineRule="auto"/>
-              <w:jc w:val="left"/>
-            </w:pPr>
-            <w:r>
-              <w:rPr>
-                <w:sz w:val="18"/>
-              </w:rPr>
-              <w:t xml:space="preserve">Superintendencia de Industria y Comercio</w:t>
-            </w:r>
-          </w:p>
-        </w:tc>
-        <w:tc>
-          <w:tcPr>
-            <w:shd w:val="clear" w:color="auto" w:fill="F5F7FB"/>
-          </w:tcPr>
-          <w:p>
-            <w:pPr>
-              <w:pStyle w:val="Compact"/>
-              <w:spacing w:after="0" w:before="0" w:line="240" w:lineRule="auto"/>
-              <w:jc w:val="left"/>
-            </w:pPr>
-            <w:r>
-              <w:rPr>
-                <w:sz w:val="18"/>
-              </w:rPr>
-              <w:t xml:space="preserve">Información clara de precios y calidad</w:t>
-            </w:r>
-          </w:p>
-        </w:tc>
-        <w:tc>
-          <w:tcPr>
-            <w:shd w:val="clear" w:color="auto" w:fill="F5F7FB"/>
-          </w:tcPr>
-          <w:p>
-            <w:pPr>
-              <w:pStyle w:val="Compact"/>
-              <w:spacing w:after="0" w:before="0" w:line="240" w:lineRule="auto"/>
-              <w:jc w:val="left"/>
-            </w:pPr>
-            <w:r>
-              <w:rPr>
-                <w:sz w:val="18"/>
-              </w:rPr>
-              <w:t xml:space="preserve">Carta con precios finales y alérgenos</w:t>
+              <w:t xml:space="preserve">Ley 1575 de 2012</w:t>
+            </w:r>
+          </w:p>
+        </w:tc>
+        <w:tc>
+          <w:tcPr>
+            <w:shd w:val="clear" w:color="auto" w:fill="F5F7FB"/>
+          </w:tcPr>
+          <w:p>
+            <w:pPr>
+              <w:pStyle w:val="Compact"/>
+              <w:spacing w:after="0" w:before="0" w:line="240" w:lineRule="auto"/>
+              <w:jc w:val="left"/>
+            </w:pPr>
+            <w:r>
+              <w:rPr>
+                <w:sz w:val="18"/>
+              </w:rPr>
+              <w:t xml:space="preserve">Cuerpo de Bomberos de Cartagena</w:t>
+            </w:r>
+          </w:p>
+        </w:tc>
+        <w:tc>
+          <w:tcPr>
+            <w:shd w:val="clear" w:color="auto" w:fill="F5F7FB"/>
+          </w:tcPr>
+          <w:p>
+            <w:pPr>
+              <w:pStyle w:val="Compact"/>
+              <w:spacing w:after="0" w:before="0" w:line="240" w:lineRule="auto"/>
+              <w:jc w:val="left"/>
+            </w:pPr>
+            <w:r>
+              <w:rPr>
+                <w:sz w:val="18"/>
+              </w:rPr>
+              <w:t xml:space="preserve">Certificado de seguridad humana y contra incendios</w:t>
+            </w:r>
+          </w:p>
+        </w:tc>
+        <w:tc>
+          <w:tcPr>
+            <w:shd w:val="clear" w:color="auto" w:fill="F5F7FB"/>
+          </w:tcPr>
+          <w:p>
+            <w:pPr>
+              <w:pStyle w:val="Compact"/>
+              <w:spacing w:after="0" w:before="0" w:line="240" w:lineRule="auto"/>
+              <w:jc w:val="left"/>
+            </w:pPr>
+            <w:r>
+              <w:rPr>
+                <w:sz w:val="18"/>
+              </w:rPr>
+              <w:t xml:space="preserve">Extintores, señalización y salidas de emergencia</w:t>
             </w:r>
           </w:p>
         </w:tc>
@@ -14108,55 +14232,55 @@
               <w:rPr>
                 <w:sz w:val="18"/>
               </w:rPr>
-              <w:t xml:space="preserve">Ley 1581 de 2012 (datos personales)</w:t>
-            </w:r>
-          </w:p>
-        </w:tc>
-        <w:tc>
-          <w:tcPr/>
-          <w:p>
-            <w:pPr>
-              <w:pStyle w:val="Compact"/>
-              <w:spacing w:after="0" w:before="0" w:line="240" w:lineRule="auto"/>
-              <w:jc w:val="left"/>
-            </w:pPr>
-            <w:r>
-              <w:rPr>
-                <w:sz w:val="18"/>
-              </w:rPr>
-              <w:t xml:space="preserve">SIC</w:t>
-            </w:r>
-          </w:p>
-        </w:tc>
-        <w:tc>
-          <w:tcPr/>
-          <w:p>
-            <w:pPr>
-              <w:pStyle w:val="Compact"/>
-              <w:spacing w:after="0" w:before="0" w:line="240" w:lineRule="auto"/>
-              <w:jc w:val="left"/>
-            </w:pPr>
-            <w:r>
-              <w:rPr>
-                <w:sz w:val="18"/>
-              </w:rPr>
-              <w:t xml:space="preserve">Autorización para tratar datos</w:t>
-            </w:r>
-          </w:p>
-        </w:tc>
-        <w:tc>
-          <w:tcPr/>
-          <w:p>
-            <w:pPr>
-              <w:pStyle w:val="Compact"/>
-              <w:spacing w:after="0" w:before="0" w:line="240" w:lineRule="auto"/>
-              <w:jc w:val="left"/>
-            </w:pPr>
-            <w:r>
-              <w:rPr>
-                <w:sz w:val="18"/>
-              </w:rPr>
-              <w:t xml:space="preserve">Política de datos en reservas por WhatsApp y fidelización</w:t>
+              <w:t xml:space="preserve">Ley 1480 de 2011 (Estatuto del Consumidor)</w:t>
+            </w:r>
+          </w:p>
+        </w:tc>
+        <w:tc>
+          <w:tcPr/>
+          <w:p>
+            <w:pPr>
+              <w:pStyle w:val="Compact"/>
+              <w:spacing w:after="0" w:before="0" w:line="240" w:lineRule="auto"/>
+              <w:jc w:val="left"/>
+            </w:pPr>
+            <w:r>
+              <w:rPr>
+                <w:sz w:val="18"/>
+              </w:rPr>
+              <w:t xml:space="preserve">Superintendencia de Industria y Comercio</w:t>
+            </w:r>
+          </w:p>
+        </w:tc>
+        <w:tc>
+          <w:tcPr/>
+          <w:p>
+            <w:pPr>
+              <w:pStyle w:val="Compact"/>
+              <w:spacing w:after="0" w:before="0" w:line="240" w:lineRule="auto"/>
+              <w:jc w:val="left"/>
+            </w:pPr>
+            <w:r>
+              <w:rPr>
+                <w:sz w:val="18"/>
+              </w:rPr>
+              <w:t xml:space="preserve">Información clara de precios y calidad</w:t>
+            </w:r>
+          </w:p>
+        </w:tc>
+        <w:tc>
+          <w:tcPr/>
+          <w:p>
+            <w:pPr>
+              <w:pStyle w:val="Compact"/>
+              <w:spacing w:after="0" w:before="0" w:line="240" w:lineRule="auto"/>
+              <w:jc w:val="left"/>
+            </w:pPr>
+            <w:r>
+              <w:rPr>
+                <w:sz w:val="18"/>
+              </w:rPr>
+              <w:t xml:space="preserve">Carta con precios finales y alérgenos</w:t>
             </w:r>
           </w:p>
         </w:tc>
@@ -14179,61 +14303,61 @@
               <w:rPr>
                 <w:sz w:val="18"/>
               </w:rPr>
-              <w:t xml:space="preserve">Ley 2232 de 2022 (plásticos de un solo uso)</w:t>
-            </w:r>
-          </w:p>
-        </w:tc>
-        <w:tc>
-          <w:tcPr>
-            <w:shd w:val="clear" w:color="auto" w:fill="F5F7FB"/>
-          </w:tcPr>
-          <w:p>
-            <w:pPr>
-              <w:pStyle w:val="Compact"/>
-              <w:spacing w:after="0" w:before="0" w:line="240" w:lineRule="auto"/>
-              <w:jc w:val="left"/>
-            </w:pPr>
-            <w:r>
-              <w:rPr>
-                <w:sz w:val="18"/>
-              </w:rPr>
-              <w:t xml:space="preserve">Minambiente</w:t>
-            </w:r>
-          </w:p>
-        </w:tc>
-        <w:tc>
-          <w:tcPr>
-            <w:shd w:val="clear" w:color="auto" w:fill="F5F7FB"/>
-          </w:tcPr>
-          <w:p>
-            <w:pPr>
-              <w:pStyle w:val="Compact"/>
-              <w:spacing w:after="0" w:before="0" w:line="240" w:lineRule="auto"/>
-              <w:jc w:val="left"/>
-            </w:pPr>
-            <w:r>
-              <w:rPr>
-                <w:sz w:val="18"/>
-              </w:rPr>
-              <w:t xml:space="preserve">Reducción gradual de plásticos de un solo uso</w:t>
-            </w:r>
-          </w:p>
-        </w:tc>
-        <w:tc>
-          <w:tcPr>
-            <w:shd w:val="clear" w:color="auto" w:fill="F5F7FB"/>
-          </w:tcPr>
-          <w:p>
-            <w:pPr>
-              <w:pStyle w:val="Compact"/>
-              <w:spacing w:after="0" w:before="0" w:line="240" w:lineRule="auto"/>
-              <w:jc w:val="left"/>
-            </w:pPr>
-            <w:r>
-              <w:rPr>
-                <w:sz w:val="18"/>
-              </w:rPr>
-              <w:t xml:space="preserve">Palillos de bambú y servilletas de papel; sin pitillos plásticos</w:t>
+              <w:t xml:space="preserve">Ley 1581 de 2012 (datos personales)</w:t>
+            </w:r>
+          </w:p>
+        </w:tc>
+        <w:tc>
+          <w:tcPr>
+            <w:shd w:val="clear" w:color="auto" w:fill="F5F7FB"/>
+          </w:tcPr>
+          <w:p>
+            <w:pPr>
+              <w:pStyle w:val="Compact"/>
+              <w:spacing w:after="0" w:before="0" w:line="240" w:lineRule="auto"/>
+              <w:jc w:val="left"/>
+            </w:pPr>
+            <w:r>
+              <w:rPr>
+                <w:sz w:val="18"/>
+              </w:rPr>
+              <w:t xml:space="preserve">SIC</w:t>
+            </w:r>
+          </w:p>
+        </w:tc>
+        <w:tc>
+          <w:tcPr>
+            <w:shd w:val="clear" w:color="auto" w:fill="F5F7FB"/>
+          </w:tcPr>
+          <w:p>
+            <w:pPr>
+              <w:pStyle w:val="Compact"/>
+              <w:spacing w:after="0" w:before="0" w:line="240" w:lineRule="auto"/>
+              <w:jc w:val="left"/>
+            </w:pPr>
+            <w:r>
+              <w:rPr>
+                <w:sz w:val="18"/>
+              </w:rPr>
+              <w:t xml:space="preserve">Autorización para tratar datos</w:t>
+            </w:r>
+          </w:p>
+        </w:tc>
+        <w:tc>
+          <w:tcPr>
+            <w:shd w:val="clear" w:color="auto" w:fill="F5F7FB"/>
+          </w:tcPr>
+          <w:p>
+            <w:pPr>
+              <w:pStyle w:val="Compact"/>
+              <w:spacing w:after="0" w:before="0" w:line="240" w:lineRule="auto"/>
+              <w:jc w:val="left"/>
+            </w:pPr>
+            <w:r>
+              <w:rPr>
+                <w:sz w:val="18"/>
+              </w:rPr>
+              <w:t xml:space="preserve">Política de datos en reservas por WhatsApp y fidelización</w:t>
             </w:r>
           </w:p>
         </w:tc>
@@ -14254,12 +14378,85 @@
               <w:rPr>
                 <w:sz w:val="18"/>
               </w:rPr>
+              <w:t xml:space="preserve">Ley 2232 de 2022 (plásticos de un solo uso)</w:t>
+            </w:r>
+          </w:p>
+        </w:tc>
+        <w:tc>
+          <w:tcPr/>
+          <w:p>
+            <w:pPr>
+              <w:pStyle w:val="Compact"/>
+              <w:spacing w:after="0" w:before="0" w:line="240" w:lineRule="auto"/>
+              <w:jc w:val="left"/>
+            </w:pPr>
+            <w:r>
+              <w:rPr>
+                <w:sz w:val="18"/>
+              </w:rPr>
+              <w:t xml:space="preserve">Minambiente</w:t>
+            </w:r>
+          </w:p>
+        </w:tc>
+        <w:tc>
+          <w:tcPr/>
+          <w:p>
+            <w:pPr>
+              <w:pStyle w:val="Compact"/>
+              <w:spacing w:after="0" w:before="0" w:line="240" w:lineRule="auto"/>
+              <w:jc w:val="left"/>
+            </w:pPr>
+            <w:r>
+              <w:rPr>
+                <w:sz w:val="18"/>
+              </w:rPr>
+              <w:t xml:space="preserve">Reducción gradual de plásticos de un solo uso</w:t>
+            </w:r>
+          </w:p>
+        </w:tc>
+        <w:tc>
+          <w:tcPr/>
+          <w:p>
+            <w:pPr>
+              <w:pStyle w:val="Compact"/>
+              <w:spacing w:after="0" w:before="0" w:line="240" w:lineRule="auto"/>
+              <w:jc w:val="left"/>
+            </w:pPr>
+            <w:r>
+              <w:rPr>
+                <w:sz w:val="18"/>
+              </w:rPr>
+              <w:t xml:space="preserve">Palillos de bambú y servilletas de papel; sin pitillos plásticos</w:t>
+            </w:r>
+          </w:p>
+        </w:tc>
+      </w:tr>
+      <w:tr>
+        <w:trPr>
+          <w:cantSplit/>
+        </w:trPr>
+        <w:tc>
+          <w:tcPr>
+            <w:shd w:val="clear" w:color="auto" w:fill="F5F7FB"/>
+          </w:tcPr>
+          <w:p>
+            <w:pPr>
+              <w:pStyle w:val="Compact"/>
+              <w:spacing w:after="0" w:before="0" w:line="240" w:lineRule="auto"/>
+              <w:jc w:val="left"/>
+            </w:pPr>
+            <w:r>
+              <w:rPr>
+                <w:sz w:val="18"/>
+              </w:rPr>
               <w:t xml:space="preserve">Decreto 1072 de 2015 (SG-SST) y Código Sustantivo del Trabajo</w:t>
             </w:r>
           </w:p>
         </w:tc>
         <w:tc>
-          <w:tcPr/>
+          <w:tcPr>
+            <w:shd w:val="clear" w:color="auto" w:fill="F5F7FB"/>
+          </w:tcPr>
           <w:p>
             <w:pPr>
               <w:pStyle w:val="Compact"/>
@@ -14275,7 +14472,9 @@
           </w:p>
         </w:tc>
         <w:tc>
-          <w:tcPr/>
+          <w:tcPr>
+            <w:shd w:val="clear" w:color="auto" w:fill="F5F7FB"/>
+          </w:tcPr>
           <w:p>
             <w:pPr>
               <w:pStyle w:val="Compact"/>
@@ -14291,7 +14490,9 @@
           </w:p>
         </w:tc>
         <w:tc>
-          <w:tcPr/>
+          <w:tcPr>
+            <w:shd w:val="clear" w:color="auto" w:fill="F5F7FB"/>
+          </w:tcPr>
           <w:p>
             <w:pPr>
               <w:pStyle w:val="Compact"/>
@@ -14322,6 +14523,14 @@
           <w:sz w:val="16"/>
         </w:rPr>
         <w:t xml:space="preserve">Fuente: Normativa colombiana vigente a octubre de 2026; recopilación del equipo.</w:t>
+      </w:r>
+    </w:p>
+    <w:p>
+      <w:pPr>
+        <w:pStyle w:val="BodyText"/>
+      </w:pPr>
+      <w:r>
+        <w:t xml:space="preserve">Cumplir estas normas es un requisito para abrir: sin concepto sanitario del DADIS, registro mercantil, RUT y certificado de bomberos el restaurante no puede operar. Por estar en el Centro Histórico, además, cualquier adecuación del local debe ser autorizada por el IPCC, lo que se tendrá en cuenta en el cronograma de apertura.</w:t>
       </w:r>
     </w:p>
     <w:bookmarkEnd w:id="49"/>
@@ -15334,23 +15543,23 @@
               <w:rPr>
                 <w:sz w:val="17"/>
               </w:rPr>
-              <w:t xml:space="preserve">—</w:t>
-            </w:r>
-          </w:p>
-        </w:tc>
-        <w:tc>
-          <w:tcPr/>
-          <w:p>
-            <w:pPr>
-              <w:pStyle w:val="Compact"/>
-              <w:spacing w:after="0" w:before="0" w:line="240" w:lineRule="auto"/>
-              <w:jc w:val="right"/>
-            </w:pPr>
-            <w:r>
-              <w:rPr>
-                <w:sz w:val="17"/>
-              </w:rPr>
-              <w:t xml:space="preserve">—</w:t>
+              <w:t xml:space="preserve">-</w:t>
+            </w:r>
+          </w:p>
+        </w:tc>
+        <w:tc>
+          <w:tcPr/>
+          <w:p>
+            <w:pPr>
+              <w:pStyle w:val="Compact"/>
+              <w:spacing w:after="0" w:before="0" w:line="240" w:lineRule="auto"/>
+              <w:jc w:val="right"/>
+            </w:pPr>
+            <w:r>
+              <w:rPr>
+                <w:sz w:val="17"/>
+              </w:rPr>
+              <w:t xml:space="preserve">-</w:t>
             </w:r>
           </w:p>
         </w:tc>
@@ -15560,6 +15769,14 @@
     </w:p>
     <w:p>
       <w:pPr>
+        <w:pStyle w:val="BodyText"/>
+      </w:pPr>
+      <w:r>
+        <w:t xml:space="preserve">La tabla detalla las mismas respuestas en números y muestra el porcentaje acumulado desde el rango más alto, que es el dato que se usa en el embudo de la demanda.</w:t>
+      </w:r>
+    </w:p>
+    <w:p>
+      <w:pPr>
         <w:pStyle w:val="TableCaption"/>
       </w:pPr>
       <w:r>
@@ -16832,6 +17049,14 @@
           <w:sz w:val="16"/>
         </w:rPr>
         <w:t xml:space="preserve">Fuente: Elaboración propia con base en la encuesta (n = 106), DANE, Migración Colombia y supuestos del equipo.</w:t>
+      </w:r>
+    </w:p>
+    <w:p>
+      <w:pPr>
+        <w:pStyle w:val="BodyText"/>
+      </w:pPr>
+      <w:r>
+        <w:t xml:space="preserve">El embudo reduce el millón de habitantes de Cartagena a las personas que realmente pueden y quieren comprar los platos de Kazegami, y les suma los turistas extranjeros. El resultado, 941.590 platos al año, es la demanda actual de referencia para todo el estudio.</w:t>
       </w:r>
     </w:p>
     <w:p>
@@ -19281,6 +19506,14 @@
     </w:p>
     <w:p>
       <w:pPr>
+        <w:pStyle w:val="BodyText"/>
+      </w:pPr>
+      <w:r>
+        <w:t xml:space="preserve">La tabla reúne indicadores del sector de restaurantes, del turismo y del consumo de sushi, con su fuente y la lectura que el equipo hace de cada uno.</w:t>
+      </w:r>
+    </w:p>
+    <w:p>
+      <w:pPr>
         <w:pStyle w:val="TableCaption"/>
       </w:pPr>
       <w:r>
@@ -20748,6 +20981,14 @@
           <w:sz w:val="16"/>
         </w:rPr>
         <w:t xml:space="preserve">Fuente: Elaboración propia con base en la encuesta (n = 106), DANE, Migración Colombia y supuestos del equipo.</w:t>
+      </w:r>
+    </w:p>
+    <w:p>
+      <w:pPr>
+        <w:pStyle w:val="BodyText"/>
+      </w:pPr>
+      <w:r>
+        <w:t xml:space="preserve">En los tres escenarios la demanda crece durante todo el periodo. El escenario base, con un crecimiento de 3,5 % anual, es el que se usa para dimensionar el restaurante, porque se apoya en el crecimiento real del gasto en comidas fuera del hogar.</w:t>
       </w:r>
     </w:p>
     <w:p>
@@ -21534,6 +21775,14 @@
     </w:p>
     <w:p>
       <w:pPr>
+        <w:pStyle w:val="BodyText"/>
+      </w:pPr>
+      <w:r>
+        <w:t xml:space="preserve">Los Rollos de sushi siguen siendo el plato con más demanda durante todo el periodo, con 502.234 unidades en 2031, lo que confirma que la barra de sushi debe ser el centro de la operación de Kazegami.</w:t>
+      </w:r>
+    </w:p>
+    <w:p>
+      <w:pPr>
         <w:pStyle w:val="CaptionedFigure"/>
         <w:keepNext/>
         <w:jc w:val="center"/>
@@ -22148,7 +22397,7 @@
                 <w:b/>
                 <w:sz w:val="18"/>
               </w:rPr>
-              <w:t xml:space="preserve">3,0 % en 2027 → 4,2 % en 2031</w:t>
+              <w:t xml:space="preserve">2,1 % en 2027 → 3,4 % en 2031</w:t>
             </w:r>
           </w:p>
         </w:tc>
@@ -23988,9 +24237,17 @@
             </w:pPr>
             <w:r>
               <w:rPr>
-                <w:sz w:val="18"/>
-              </w:rPr>
-              <w:t xml:space="preserve">Influencia primaria: turismo y vida nocturna (a 5 min de Manga)</w:t>
+                <w:bCs/>
+                <w:b/>
+                <w:sz w:val="18"/>
+              </w:rPr>
+              <w:t xml:space="preserve">Ubicación propuesta</w:t>
+            </w:r>
+            <w:r>
+              <w:rPr>
+                <w:sz w:val="18"/>
+              </w:rPr>
+              <w:t xml:space="preserve">: turismo, hoteles y vida nocturna</w:t>
             </w:r>
           </w:p>
         </w:tc>
@@ -24065,17 +24322,9 @@
             </w:pPr>
             <w:r>
               <w:rPr>
-                <w:bCs/>
-                <w:b/>
-                <w:sz w:val="18"/>
-              </w:rPr>
-              <w:t xml:space="preserve">Ubicación propuesta</w:t>
-            </w:r>
-            <w:r>
-              <w:rPr>
-                <w:sz w:val="18"/>
-              </w:rPr>
-              <w:t xml:space="preserve">: residencial, cercana a Bazurto y al Centro</w:t>
+                <w:sz w:val="18"/>
+              </w:rPr>
+              <w:t xml:space="preserve">Influencia primaria residencial, a 5 minutos del Centro</w:t>
             </w:r>
           </w:p>
         </w:tc>
@@ -24420,7 +24669,7 @@
         <w:t xml:space="preserve"> </w:t>
       </w:r>
       <w:r>
-        <w:t xml:space="preserve">concentra el consumo actual y la preferencia de ubicación. Manga queda en el centro geográfico de ese triángulo, a menos de 10 minutos de las tres zonas y del Mercado de Bazurto; por eso el Estudio Técnico la selecciona como microlocalización.</w:t>
+        <w:t xml:space="preserve">concentra el consumo actual y la preferencia de ubicación. Dentro de él, el Centro Histórico es la zona con más consumo de cocina japonesa y más votos, y es el punto de llegada de los turistas; por eso el Estudio Técnico la selecciona como microlocalización, con Manga y Bocagrande como zonas de influencia cercanas.</w:t>
       </w:r>
     </w:p>
     <w:bookmarkEnd w:id="102"/>
@@ -26615,6 +26864,14 @@
         <w:t xml:space="preserve">Fuente: Encuesta de mercado Kazegami (n = 106), octubre de 2026. Elaboración propia.</w:t>
       </w:r>
     </w:p>
+    <w:p>
+      <w:pPr>
+        <w:pStyle w:val="BodyText"/>
+      </w:pPr>
+      <w:r>
+        <w:t xml:space="preserve">Las respuestas de Kazegami se concentran en las dos quejas más frecuentes, el precio y el tamaño de la porción. Atender estas debilidades es la principal forma de diferenciarse de los competidores actuales.</w:t>
+      </w:r>
+    </w:p>
     <w:bookmarkStart w:id="108" w:name="régimen-de-mercado"/>
     <w:p>
       <w:pPr>
@@ -26660,7 +26917,7 @@
         <w:pStyle w:val="FirstParagraph"/>
       </w:pPr>
       <w:r>
-        <w:t xml:space="preserve">La cantidad de platos que los competidores pueden ofrecer depende de factores externos que también afectarán a Kazegami. La tabla identifica los seis factores de la oferta vistos en clase y cómo se presentan en Cartagena.</w:t>
+        <w:t xml:space="preserve">La cantidad de platos que los competidores pueden ofrecer depende de factores externos que también afectarán a Kazegami. La tabla identifica los seis factores que determinan la oferta y cómo se presentan en Cartagena.</w:t>
       </w:r>
     </w:p>
     <w:p>
@@ -27115,7 +27372,15 @@
           <w:color w:val="52514E"/>
           <w:sz w:val="16"/>
         </w:rPr>
-        <w:t xml:space="preserve">Fuente: Clase del Seminario Taller (factores de la oferta) aplicados por el equipo.</w:t>
+        <w:t xml:space="preserve">Fuente: Elaboración propia.</w:t>
+      </w:r>
+    </w:p>
+    <w:p>
+      <w:pPr>
+        <w:pStyle w:val="BodyText"/>
+      </w:pPr>
+      <w:r>
+        <w:t xml:space="preserve">Los factores que más pueden afectar la oferta de Kazegami son el costo de los insumos y el clima, porque la pesca artesanal se reduce en la temporada de mar de leva. Por eso se prevén proveedores alternativos y una reserva de pescado ultracongelado.</w:t>
       </w:r>
     </w:p>
     <w:bookmarkEnd w:id="109"/>
@@ -27556,6 +27821,14 @@
         </w:tc>
       </w:tr>
     </w:tbl>
+    <w:p>
+      <w:pPr>
+        <w:pStyle w:val="BodyText"/>
+      </w:pPr>
+      <w:r>
+        <w:t xml:space="preserve">La oferta actual se estima en 629.000 platos al año. Como la venta diaria por restaurante es una estimación, esta cifra debe tomarse como un orden de magnitud; aun así, queda por debajo de la demanda actual de 941.590 platos, lo que anticipa la existencia de demanda insatisfecha.</w:t>
+      </w:r>
+    </w:p>
     <w:bookmarkEnd w:id="110"/>
     <w:bookmarkEnd w:id="111"/>
     <w:bookmarkStart w:id="115" w:name="proveedores"/>
@@ -28582,7 +28855,7 @@
               <w:rPr>
                 <w:sz w:val="18"/>
               </w:rPr>
-              <w:t xml:space="preserve">—</w:t>
+              <w:t xml:space="preserve">-</w:t>
             </w:r>
           </w:p>
         </w:tc>
@@ -29354,7 +29627,7 @@
               <w:rPr>
                 <w:sz w:val="16"/>
               </w:rPr>
-              <w:t xml:space="preserve">—</w:t>
+              <w:t xml:space="preserve">-</w:t>
             </w:r>
           </w:p>
         </w:tc>
@@ -29370,7 +29643,7 @@
               <w:rPr>
                 <w:sz w:val="16"/>
               </w:rPr>
-              <w:t xml:space="preserve">—</w:t>
+              <w:t xml:space="preserve">-</w:t>
             </w:r>
           </w:p>
         </w:tc>
@@ -29483,7 +29756,7 @@
               <w:rPr>
                 <w:sz w:val="16"/>
               </w:rPr>
-              <w:t xml:space="preserve">29.353</w:t>
+              <w:t xml:space="preserve">20.547</w:t>
             </w:r>
           </w:p>
         </w:tc>
@@ -29501,7 +29774,7 @@
               <w:rPr>
                 <w:sz w:val="16"/>
               </w:rPr>
-              <w:t xml:space="preserve">8,8 %</w:t>
+              <w:t xml:space="preserve">6,2 %</w:t>
             </w:r>
           </w:p>
         </w:tc>
@@ -29602,7 +29875,7 @@
               <w:rPr>
                 <w:sz w:val="16"/>
               </w:rPr>
-              <w:t xml:space="preserve">34.049</w:t>
+              <w:t xml:space="preserve">24.950</w:t>
             </w:r>
           </w:p>
         </w:tc>
@@ -29618,7 +29891,7 @@
               <w:rPr>
                 <w:sz w:val="16"/>
               </w:rPr>
-              <w:t xml:space="preserve">9,6 %</w:t>
+              <w:t xml:space="preserve">7,0 %</w:t>
             </w:r>
           </w:p>
         </w:tc>
@@ -29731,7 +30004,7 @@
               <w:rPr>
                 <w:sz w:val="16"/>
               </w:rPr>
-              <w:t xml:space="preserve">38.746</w:t>
+              <w:t xml:space="preserve">29.353</w:t>
             </w:r>
           </w:p>
         </w:tc>
@@ -29749,7 +30022,7 @@
               <w:rPr>
                 <w:sz w:val="16"/>
               </w:rPr>
-              <w:t xml:space="preserve">10,3 %</w:t>
+              <w:t xml:space="preserve">7,8 %</w:t>
             </w:r>
           </w:p>
         </w:tc>
@@ -29850,7 +30123,7 @@
               <w:rPr>
                 <w:sz w:val="16"/>
               </w:rPr>
-              <w:t xml:space="preserve">42.855</w:t>
+              <w:t xml:space="preserve">33.756</w:t>
             </w:r>
           </w:p>
         </w:tc>
@@ -29866,7 +30139,7 @@
               <w:rPr>
                 <w:sz w:val="16"/>
               </w:rPr>
-              <w:t xml:space="preserve">10,7 %</w:t>
+              <w:t xml:space="preserve">8,4 %</w:t>
             </w:r>
           </w:p>
         </w:tc>
@@ -29979,7 +30252,7 @@
               <w:rPr>
                 <w:sz w:val="16"/>
               </w:rPr>
-              <w:t xml:space="preserve">46.965</w:t>
+              <w:t xml:space="preserve">38.159</w:t>
             </w:r>
           </w:p>
         </w:tc>
@@ -29997,7 +30270,7 @@
               <w:rPr>
                 <w:sz w:val="16"/>
               </w:rPr>
-              <w:t xml:space="preserve">11,0 %</w:t>
+              <w:t xml:space="preserve">9,0 %</w:t>
             </w:r>
           </w:p>
         </w:tc>
@@ -30792,7 +31065,7 @@
           <w:bCs/>
           <w:b/>
         </w:rPr>
-        <w:t xml:space="preserve">8,8 %</w:t>
+        <w:t xml:space="preserve">6,2 %</w:t>
       </w:r>
       <w:r>
         <w:t xml:space="preserve"> </w:t>
@@ -30808,13 +31081,13 @@
           <w:bCs/>
           <w:b/>
         </w:rPr>
-        <w:t xml:space="preserve">11,0 %</w:t>
+        <w:t xml:space="preserve">9,0 %</w:t>
       </w:r>
       <w:r>
         <w:t xml:space="preserve"> </w:t>
       </w:r>
       <w:r>
-        <w:t xml:space="preserve">(2031) de esa brecha para usar su capacidad, lo que equivale a una cuota de mercado de 3,0 % a 4,2 %. La meta es</w:t>
+        <w:t xml:space="preserve">(2031) de esa brecha para usar su capacidad, lo que equivale a una cuota de mercado de 2,1 % a 3,4 %. La meta es</w:t>
       </w:r>
       <w:r>
         <w:t xml:space="preserve"> </w:t>
@@ -31660,43 +31933,43 @@
               <w:rPr>
                 <w:sz w:val="18"/>
               </w:rPr>
-              <w:t xml:space="preserve">$681</w:t>
-            </w:r>
-          </w:p>
-        </w:tc>
-        <w:tc>
-          <w:tcPr>
-            <w:shd w:val="clear" w:color="auto" w:fill="F5F7FB"/>
-          </w:tcPr>
-          <w:p>
-            <w:pPr>
-              <w:pStyle w:val="Compact"/>
-              <w:spacing w:after="0" w:before="0" w:line="240" w:lineRule="auto"/>
-              <w:jc w:val="right"/>
-            </w:pPr>
-            <w:r>
-              <w:rPr>
-                <w:sz w:val="18"/>
-              </w:rPr>
-              <w:t xml:space="preserve">$1.070</w:t>
-            </w:r>
-          </w:p>
-        </w:tc>
-        <w:tc>
-          <w:tcPr>
-            <w:shd w:val="clear" w:color="auto" w:fill="F5F7FB"/>
-          </w:tcPr>
-          <w:p>
-            <w:pPr>
-              <w:pStyle w:val="Compact"/>
-              <w:spacing w:after="0" w:before="0" w:line="240" w:lineRule="auto"/>
-              <w:jc w:val="right"/>
-            </w:pPr>
-            <w:r>
-              <w:rPr>
-                <w:sz w:val="18"/>
-              </w:rPr>
-              <w:t xml:space="preserve">$735</w:t>
+              <w:t xml:space="preserve">$972</w:t>
+            </w:r>
+          </w:p>
+        </w:tc>
+        <w:tc>
+          <w:tcPr>
+            <w:shd w:val="clear" w:color="auto" w:fill="F5F7FB"/>
+          </w:tcPr>
+          <w:p>
+            <w:pPr>
+              <w:pStyle w:val="Compact"/>
+              <w:spacing w:after="0" w:before="0" w:line="240" w:lineRule="auto"/>
+              <w:jc w:val="right"/>
+            </w:pPr>
+            <w:r>
+              <w:rPr>
+                <w:sz w:val="18"/>
+              </w:rPr>
+              <w:t xml:space="preserve">$1.528</w:t>
+            </w:r>
+          </w:p>
+        </w:tc>
+        <w:tc>
+          <w:tcPr>
+            <w:shd w:val="clear" w:color="auto" w:fill="F5F7FB"/>
+          </w:tcPr>
+          <w:p>
+            <w:pPr>
+              <w:pStyle w:val="Compact"/>
+              <w:spacing w:after="0" w:before="0" w:line="240" w:lineRule="auto"/>
+              <w:jc w:val="right"/>
+            </w:pPr>
+            <w:r>
+              <w:rPr>
+                <w:sz w:val="18"/>
+              </w:rPr>
+              <w:t xml:space="preserve">$1.049</w:t>
             </w:r>
           </w:p>
         </w:tc>
@@ -31737,7 +32010,7 @@
                 <w:b/>
                 <w:sz w:val="18"/>
               </w:rPr>
-              <w:t xml:space="preserve">$11.768</w:t>
+              <w:t xml:space="preserve">$12.060</w:t>
             </w:r>
           </w:p>
         </w:tc>
@@ -31755,7 +32028,7 @@
                 <w:b/>
                 <w:sz w:val="18"/>
               </w:rPr>
-              <w:t xml:space="preserve">$13.189</w:t>
+              <w:t xml:space="preserve">$13.648</w:t>
             </w:r>
           </w:p>
         </w:tc>
@@ -31773,7 +32046,7 @@
                 <w:b/>
                 <w:sz w:val="18"/>
               </w:rPr>
-              <w:t xml:space="preserve">$12.687</w:t>
+              <w:t xml:space="preserve">$13.002</w:t>
             </w:r>
           </w:p>
         </w:tc>
@@ -32187,39 +32460,39 @@
               <w:rPr>
                 <w:sz w:val="18"/>
               </w:rPr>
-              <w:t xml:space="preserve">$25.269</w:t>
-            </w:r>
-          </w:p>
-        </w:tc>
-        <w:tc>
-          <w:tcPr/>
-          <w:p>
-            <w:pPr>
-              <w:pStyle w:val="Compact"/>
-              <w:spacing w:after="0" w:before="0" w:line="240" w:lineRule="auto"/>
-              <w:jc w:val="right"/>
-            </w:pPr>
-            <w:r>
-              <w:rPr>
-                <w:sz w:val="18"/>
-              </w:rPr>
-              <w:t xml:space="preserve">$21.996</w:t>
-            </w:r>
-          </w:p>
-        </w:tc>
-        <w:tc>
-          <w:tcPr/>
-          <w:p>
-            <w:pPr>
-              <w:pStyle w:val="Compact"/>
-              <w:spacing w:after="0" w:before="0" w:line="240" w:lineRule="auto"/>
-              <w:jc w:val="right"/>
-            </w:pPr>
-            <w:r>
-              <w:rPr>
-                <w:sz w:val="18"/>
-              </w:rPr>
-              <w:t xml:space="preserve">$22.498</w:t>
+              <w:t xml:space="preserve">$24.977</w:t>
+            </w:r>
+          </w:p>
+        </w:tc>
+        <w:tc>
+          <w:tcPr/>
+          <w:p>
+            <w:pPr>
+              <w:pStyle w:val="Compact"/>
+              <w:spacing w:after="0" w:before="0" w:line="240" w:lineRule="auto"/>
+              <w:jc w:val="right"/>
+            </w:pPr>
+            <w:r>
+              <w:rPr>
+                <w:sz w:val="18"/>
+              </w:rPr>
+              <w:t xml:space="preserve">$21.537</w:t>
+            </w:r>
+          </w:p>
+        </w:tc>
+        <w:tc>
+          <w:tcPr/>
+          <w:p>
+            <w:pPr>
+              <w:pStyle w:val="Compact"/>
+              <w:spacing w:after="0" w:before="0" w:line="240" w:lineRule="auto"/>
+              <w:jc w:val="right"/>
+            </w:pPr>
+            <w:r>
+              <w:rPr>
+                <w:sz w:val="18"/>
+              </w:rPr>
+              <w:t xml:space="preserve">$22.183</w:t>
             </w:r>
           </w:p>
         </w:tc>
@@ -32260,43 +32533,43 @@
               <w:rPr>
                 <w:sz w:val="18"/>
               </w:rPr>
-              <w:t xml:space="preserve">68,2 %</w:t>
-            </w:r>
-          </w:p>
-        </w:tc>
-        <w:tc>
-          <w:tcPr>
-            <w:shd w:val="clear" w:color="auto" w:fill="F5F7FB"/>
-          </w:tcPr>
-          <w:p>
-            <w:pPr>
-              <w:pStyle w:val="Compact"/>
-              <w:spacing w:after="0" w:before="0" w:line="240" w:lineRule="auto"/>
-              <w:jc w:val="right"/>
-            </w:pPr>
-            <w:r>
-              <w:rPr>
-                <w:sz w:val="18"/>
-              </w:rPr>
-              <w:t xml:space="preserve">62,5 %</w:t>
-            </w:r>
-          </w:p>
-        </w:tc>
-        <w:tc>
-          <w:tcPr>
-            <w:shd w:val="clear" w:color="auto" w:fill="F5F7FB"/>
-          </w:tcPr>
-          <w:p>
-            <w:pPr>
-              <w:pStyle w:val="Compact"/>
-              <w:spacing w:after="0" w:before="0" w:line="240" w:lineRule="auto"/>
-              <w:jc w:val="right"/>
-            </w:pPr>
-            <w:r>
-              <w:rPr>
-                <w:sz w:val="18"/>
-              </w:rPr>
-              <w:t xml:space="preserve">63,9 %</w:t>
+              <w:t xml:space="preserve">67,4 %</w:t>
+            </w:r>
+          </w:p>
+        </w:tc>
+        <w:tc>
+          <w:tcPr>
+            <w:shd w:val="clear" w:color="auto" w:fill="F5F7FB"/>
+          </w:tcPr>
+          <w:p>
+            <w:pPr>
+              <w:pStyle w:val="Compact"/>
+              <w:spacing w:after="0" w:before="0" w:line="240" w:lineRule="auto"/>
+              <w:jc w:val="right"/>
+            </w:pPr>
+            <w:r>
+              <w:rPr>
+                <w:sz w:val="18"/>
+              </w:rPr>
+              <w:t xml:space="preserve">61,2 %</w:t>
+            </w:r>
+          </w:p>
+        </w:tc>
+        <w:tc>
+          <w:tcPr>
+            <w:shd w:val="clear" w:color="auto" w:fill="F5F7FB"/>
+          </w:tcPr>
+          <w:p>
+            <w:pPr>
+              <w:pStyle w:val="Compact"/>
+              <w:spacing w:after="0" w:before="0" w:line="240" w:lineRule="auto"/>
+              <w:jc w:val="right"/>
+            </w:pPr>
+            <w:r>
+              <w:rPr>
+                <w:sz w:val="18"/>
+              </w:rPr>
+              <w:t xml:space="preserve">63,0 %</w:t>
             </w:r>
           </w:p>
         </w:tc>
@@ -32606,7 +32879,7 @@
               <w:rPr>
                 <w:sz w:val="18"/>
               </w:rPr>
-              <w:t xml:space="preserve">—</w:t>
+              <w:t xml:space="preserve">-</w:t>
             </w:r>
           </w:p>
         </w:tc>
@@ -32909,7 +33182,7 @@
       <w:r>
         <w:drawing>
           <wp:inline>
-            <wp:extent cx="5579999" cy="2517944"/>
+            <wp:extent cx="5579999" cy="2522553"/>
             <wp:effectExtent b="0" l="0" r="0" t="0"/>
             <wp:docPr descr="Figura 25. Cadena de abastecimiento y canal de distribución directo" title="" id="134" name="Picture"/>
             <a:graphic>
@@ -32930,7 +33203,7 @@
                   <pic:spPr bwMode="auto">
                     <a:xfrm>
                       <a:off x="0" y="0"/>
-                      <a:ext cx="5579999" cy="2517944"/>
+                      <a:ext cx="5579999" cy="2522553"/>
                     </a:xfrm>
                     <a:prstGeom prst="rect">
                       <a:avLst/>
@@ -33760,6 +34033,14 @@
         </w:tc>
       </w:tr>
     </w:tbl>
+    <w:p>
+      <w:pPr>
+        <w:pStyle w:val="BodyText"/>
+      </w:pPr>
+      <w:r>
+        <w:t xml:space="preserve">Los insumos más delicados son el pescado para consumo crudo y el arroz de sushi preparado, que tienen las vidas útiles más cortas. Estos tiempos definen la frecuencia de compra a los proveedores y la capacidad de los equipos de refrigeración del Estudio Técnico.</w:t>
+      </w:r>
+    </w:p>
     <w:bookmarkEnd w:id="136"/>
     <w:bookmarkStart w:id="137" w:name="sistemas-de-transporte"/>
     <w:p>
@@ -33775,7 +34056,7 @@
         <w:pStyle w:val="FirstParagraph"/>
       </w:pPr>
       <w:r>
-        <w:t xml:space="preserve">El transporte cubre el trayecto de los insumos desde cada proveedor hasta el local y la forma en que los clientes llegan al restaurante. La ubicación en Manga permite que el pescado de Bazurto llegue en menos de 20 minutos sin romper la cadena de frío.</w:t>
+        <w:t xml:space="preserve">El transporte cubre el trayecto de los insumos desde cada proveedor hasta el local y la forma en que los clientes llegan al restaurante. Desde el Mercado de Bazurto hasta el Centro Histórico hay unos 3 km, por lo que el pescado llega en menos de 20 minutos sin romper la cadena de frío.</w:t>
       </w:r>
     </w:p>
     <w:p>
@@ -33917,7 +34198,7 @@
               <w:rPr>
                 <w:sz w:val="18"/>
               </w:rPr>
-              <w:t xml:space="preserve">Bazurto / Mercado del Mar → local en Manga (distancia corta, aprox.)</w:t>
+              <w:t xml:space="preserve">Bazurto / Mercado del Mar → local en el Centro Histórico (≈ 3 km)</w:t>
             </w:r>
           </w:p>
         </w:tc>
@@ -34194,6 +34475,14 @@
         </w:tc>
       </w:tr>
     </w:tbl>
+    <w:p>
+      <w:pPr>
+        <w:pStyle w:val="BodyText"/>
+      </w:pPr>
+      <w:r>
+        <w:t xml:space="preserve">El tramo crítico es el del pescado desde Bazurto, porque de él depende la cadena de frío; por eso se exige transporte en neveras con hielo y un trayecto corto. Los insumos secos e importados no requieren condiciones especiales.</w:t>
+      </w:r>
+    </w:p>
     <w:bookmarkEnd w:id="137"/>
     <w:bookmarkStart w:id="138" w:name="presentación-del-producto-o-servicio"/>
     <w:p>
@@ -34209,7 +34498,7 @@
         <w:pStyle w:val="FirstParagraph"/>
       </w:pPr>
       <w:r>
-        <w:t xml:space="preserve">La presentación del servicio es lo que el cliente ve y vive dentro del local. Como la propuesta de valor de Kazegami es la experiencia japonesa en el restaurante, cada elemento —la barra, la vajilla, la carta, el ambiente, los uniformes y el horario— se definió para reforzarla.</w:t>
+        <w:t xml:space="preserve">La presentación del servicio es lo que el cliente ve y vive dentro del local. Como la propuesta de valor de Kazegami es la experiencia japonesa en el restaurante, cada elemento (la barra, la vajilla, la carta, el ambiente, los uniformes y el horario) se definió para reforzarla.</w:t>
       </w:r>
     </w:p>
     <w:p>
@@ -34528,6 +34817,14 @@
         </w:tc>
       </w:tr>
     </w:tbl>
+    <w:p>
+      <w:pPr>
+        <w:pStyle w:val="BodyText"/>
+      </w:pPr>
+      <w:r>
+        <w:t xml:space="preserve">Todos los elementos de la presentación buscan reforzar la experiencia japonesa que diferencia a Kazegami. El horario continuo permite atender tanto el almuerzo de los ejecutivos como la cena de parejas y turistas.</w:t>
+      </w:r>
+    </w:p>
     <w:bookmarkEnd w:id="138"/>
     <w:bookmarkStart w:id="139" w:name="X4efafa37321ed52a8bd353b609ed775b902b667"/>
     <w:p>
@@ -34985,6 +35282,14 @@
         </w:tc>
       </w:tr>
     </w:tbl>
+    <w:p>
+      <w:pPr>
+        <w:pStyle w:val="BodyText"/>
+      </w:pPr>
+      <w:r>
+        <w:t xml:space="preserve">Ofrecer pagos con tarjeta, QR y billeteras digitales evita perder ventas, aunque las comisiones de los datáfonos son un costo que se incluye en la comercialización. El crédito se limita a empresas para no comprometer la liquidez del restaurante.</w:t>
+      </w:r>
+    </w:p>
     <w:bookmarkEnd w:id="139"/>
     <w:bookmarkStart w:id="143" w:name="Xe412013e2b8bbcaad66f6896f39f66cfc8d8f22"/>
     <w:p>
@@ -35000,7 +35305,7 @@
         <w:pStyle w:val="FirstParagraph"/>
       </w:pPr>
       <w:r>
-        <w:t xml:space="preserve">La asistencia al usuario en un restaurante corresponde al protocolo de atención, desde la reserva hasta el pago. Los tiempos de entrega se fijaron como un estándar operativo del equipo que considera el tiempo real de preparación de cada plato —el armado y corte del rollo, la cocción del fideo y el montaje del ramen, y la fritura de la tempura— más la cola de pedidos en las horas de mayor afluencia. Son tiempos realistas que evitan la demora en el servicio, queja del 18,9 % de los encuestados.</w:t>
+        <w:t xml:space="preserve">La asistencia al usuario en un restaurante corresponde al protocolo de atención, desde la reserva hasta el pago. Los tiempos de entrega se fijaron como un estándar operativo del equipo que considera el tiempo real de preparación de cada plato (el armado y corte del rollo, la cocción del fideo y el montaje del ramen, y la fritura de la tempura) más la cola de pedidos en las horas de mayor afluencia. Son tiempos realistas que evitan la demora en el servicio, queja del 18,9 % de los encuestados.</w:t>
       </w:r>
     </w:p>
     <w:p>
@@ -35436,7 +35741,7 @@
               <w:rPr>
                 <w:sz w:val="18"/>
               </w:rPr>
-              <w:t xml:space="preserve">—</w:t>
+              <w:t xml:space="preserve">-</w:t>
             </w:r>
           </w:p>
         </w:tc>
@@ -35749,7 +36054,7 @@
               <w:rPr>
                 <w:sz w:val="18"/>
               </w:rPr>
-              <w:t xml:space="preserve">Restaurante físico en Manga</w:t>
+              <w:t xml:space="preserve">Restaurante físico en el Centro Histórico</w:t>
             </w:r>
           </w:p>
         </w:tc>
@@ -36676,7 +36981,7 @@
               <w:rPr>
                 <w:sz w:val="17"/>
               </w:rPr>
-              <w:t xml:space="preserve">Residentes de Manga, Centro y Bocagrande</w:t>
+              <w:t xml:space="preserve">Turistas y residentes del Centro, Manga y Bocagrande</w:t>
             </w:r>
           </w:p>
         </w:tc>
@@ -37265,7 +37570,22 @@
         </w:tc>
       </w:tr>
     </w:tbl>
-    <w:p/>
+    <w:p>
+      <w:pPr>
+        <w:pStyle w:val="BodyText"/>
+      </w:pPr>
+      <w:r>
+        <w:t xml:space="preserve">El plan concentra la inversión en redes sociales y pauta digital, que son los canales que más usa el público objetivo, y en las alianzas con hoteles del Centro Histórico, que llevan turistas al restaurante.</w:t>
+      </w:r>
+    </w:p>
+    <w:p>
+      <w:pPr>
+        <w:pStyle w:val="BodyText"/>
+      </w:pPr>
+      <w:r>
+        <w:t xml:space="preserve">La tabla resume cuánto cuesta cada acción de comercialización al mes y al año, junto con los costos de las plataformas de reservas y de los medios de pago.</w:t>
+      </w:r>
+    </w:p>
     <w:p>
       <w:pPr>
         <w:pStyle w:val="TableCaption"/>
@@ -37915,615 +38235,49 @@
         <w:pStyle w:val="FirstParagraph"/>
       </w:pPr>
       <w:r>
-        <w:t xml:space="preserve">La tabla resume los principales hallazgos del estudio de mercado y la evidencia que los sustenta.</w:t>
-      </w:r>
-    </w:p>
-    <w:p>
-      <w:pPr>
-        <w:pStyle w:val="TableCaption"/>
-      </w:pPr>
-      <w:r>
-        <w:t xml:space="preserve">Tabla 52. Conclusiones del estudio de mercado</w:t>
-      </w:r>
-    </w:p>
-    <w:tbl>
-      <w:tblPr>
-        <w:tblStyle w:val="Table"/>
-        <w:tblLook w:firstRow="1" w:lastRow="0" w:firstColumn="0" w:lastColumn="0" w:noHBand="0" w:noVBand="0" w:val="0020"/>
-        <w:tblCaption w:val="Tabla 52. Conclusiones del estudio de mercado"/>
-        <w:jc w:val="center"/>
-        <w:tblBorders>
-          <w:top w:val="single" w:sz="4" w:space="0" w:color="9FB3CF"/>
-          <w:left w:val="single" w:sz="4" w:space="0" w:color="9FB3CF"/>
-          <w:bottom w:val="single" w:sz="4" w:space="0" w:color="9FB3CF"/>
-          <w:right w:val="single" w:sz="4" w:space="0" w:color="9FB3CF"/>
-          <w:insideH w:val="single" w:sz="4" w:space="0" w:color="9FB3CF"/>
-          <w:insideV w:val="single" w:sz="4" w:space="0" w:color="9FB3CF"/>
-        </w:tblBorders>
-        <w:tblW w:w="5000" w:type="pct"/>
-        <w:tblCellMar>
-          <w:top w:w="30" w:type="dxa"/>
-          <w:bottom w:w="30" w:type="dxa"/>
-          <w:left w:w="70" w:type="dxa"/>
-          <w:right w:w="70" w:type="dxa"/>
-        </w:tblCellMar>
-      </w:tblPr>
-      <w:tblGrid>
-        <w:gridCol w:w="1498"/>
-        <w:gridCol w:w="3210"/>
-        <w:gridCol w:w="3210"/>
-      </w:tblGrid>
-      <w:tr>
-        <w:trPr>
-          <w:tblHeader w:val="true"/>
-          <w:tblHeader w:val="true"/>
-          <w:cantSplit/>
-        </w:trPr>
-        <w:tc>
-          <w:tcPr>
-            <w:shd w:val="clear" w:color="auto" w:fill="D6E6F8"/>
-          </w:tcPr>
-          <w:p>
-            <w:pPr>
-              <w:pStyle w:val="Compact"/>
-              <w:spacing w:after="0" w:before="0" w:line="240" w:lineRule="auto"/>
-              <w:jc w:val="left"/>
-            </w:pPr>
-            <w:r>
-              <w:rPr>
-                <w:b/>
-                <w:color w:val="1F3A68"/>
-                <w:sz w:val="18"/>
-              </w:rPr>
-              <w:t xml:space="preserve">Tema</w:t>
-            </w:r>
-          </w:p>
-        </w:tc>
-        <w:tc>
-          <w:tcPr>
-            <w:shd w:val="clear" w:color="auto" w:fill="D6E6F8"/>
-          </w:tcPr>
-          <w:p>
-            <w:pPr>
-              <w:pStyle w:val="Compact"/>
-              <w:spacing w:after="0" w:before="0" w:line="240" w:lineRule="auto"/>
-              <w:jc w:val="left"/>
-            </w:pPr>
-            <w:r>
-              <w:rPr>
-                <w:b/>
-                <w:color w:val="1F3A68"/>
-                <w:sz w:val="18"/>
-              </w:rPr>
-              <w:t xml:space="preserve">Conclusión</w:t>
-            </w:r>
-          </w:p>
-        </w:tc>
-        <w:tc>
-          <w:tcPr>
-            <w:shd w:val="clear" w:color="auto" w:fill="D6E6F8"/>
-          </w:tcPr>
-          <w:p>
-            <w:pPr>
-              <w:pStyle w:val="Compact"/>
-              <w:spacing w:after="0" w:before="0" w:line="240" w:lineRule="auto"/>
-              <w:jc w:val="left"/>
-            </w:pPr>
-            <w:r>
-              <w:rPr>
-                <w:b/>
-                <w:color w:val="1F3A68"/>
-                <w:sz w:val="18"/>
-              </w:rPr>
-              <w:t xml:space="preserve">Evidencia</w:t>
-            </w:r>
-          </w:p>
-        </w:tc>
-      </w:tr>
-      <w:tr>
-        <w:trPr>
-          <w:cantSplit/>
-        </w:trPr>
-        <w:tc>
-          <w:tcPr/>
-          <w:p>
-            <w:pPr>
-              <w:pStyle w:val="Compact"/>
-              <w:spacing w:after="0" w:before="0" w:line="240" w:lineRule="auto"/>
-              <w:jc w:val="left"/>
-            </w:pPr>
-            <w:r>
-              <w:rPr>
-                <w:sz w:val="18"/>
-              </w:rPr>
-              <w:t xml:space="preserve">Aceptación</w:t>
-            </w:r>
-          </w:p>
-        </w:tc>
-        <w:tc>
-          <w:tcPr/>
-          <w:p>
-            <w:pPr>
-              <w:pStyle w:val="Compact"/>
-              <w:spacing w:after="0" w:before="0" w:line="240" w:lineRule="auto"/>
-              <w:jc w:val="left"/>
-            </w:pPr>
-            <w:r>
-              <w:rPr>
-                <w:sz w:val="18"/>
-              </w:rPr>
-              <w:t xml:space="preserve">El mercado acepta la cocina japonesa</w:t>
-            </w:r>
-          </w:p>
-        </w:tc>
-        <w:tc>
-          <w:tcPr/>
-          <w:p>
-            <w:pPr>
-              <w:pStyle w:val="Compact"/>
-              <w:spacing w:after="0" w:before="0" w:line="240" w:lineRule="auto"/>
-              <w:jc w:val="left"/>
-            </w:pPr>
-            <w:r>
-              <w:rPr>
-                <w:sz w:val="18"/>
-              </w:rPr>
-              <w:t xml:space="preserve">96,2 % consume o probaría; 82,9 % encuentra atractivo el concepto</w:t>
-            </w:r>
-          </w:p>
-        </w:tc>
-      </w:tr>
-      <w:tr>
-        <w:trPr>
-          <w:cantSplit/>
-        </w:trPr>
-        <w:tc>
-          <w:tcPr>
-            <w:shd w:val="clear" w:color="auto" w:fill="F5F7FB"/>
-          </w:tcPr>
-          <w:p>
-            <w:pPr>
-              <w:pStyle w:val="Compact"/>
-              <w:spacing w:after="0" w:before="0" w:line="240" w:lineRule="auto"/>
-              <w:jc w:val="left"/>
-            </w:pPr>
-            <w:r>
-              <w:rPr>
-                <w:sz w:val="18"/>
-              </w:rPr>
-              <w:t xml:space="preserve">Portafolio</w:t>
-            </w:r>
-          </w:p>
-        </w:tc>
-        <w:tc>
-          <w:tcPr>
-            <w:shd w:val="clear" w:color="auto" w:fill="F5F7FB"/>
-          </w:tcPr>
-          <w:p>
-            <w:pPr>
-              <w:pStyle w:val="Compact"/>
-              <w:spacing w:after="0" w:before="0" w:line="240" w:lineRule="auto"/>
-              <w:jc w:val="left"/>
-            </w:pPr>
-            <w:r>
-              <w:rPr>
-                <w:sz w:val="18"/>
-              </w:rPr>
-              <w:t xml:space="preserve">Rollos de sushi, Ramen y Tempura concentran la preferencia</w:t>
-            </w:r>
-          </w:p>
-        </w:tc>
-        <w:tc>
-          <w:tcPr>
-            <w:shd w:val="clear" w:color="auto" w:fill="F5F7FB"/>
-          </w:tcPr>
-          <w:p>
-            <w:pPr>
-              <w:pStyle w:val="Compact"/>
-              <w:spacing w:after="0" w:before="0" w:line="240" w:lineRule="auto"/>
-              <w:jc w:val="left"/>
-            </w:pPr>
-            <w:r>
-              <w:rPr>
-                <w:sz w:val="18"/>
-              </w:rPr>
-              <w:t xml:space="preserve">61, 40 y 35 menciones; 77,7 % de las menciones a platos</w:t>
-            </w:r>
-          </w:p>
-        </w:tc>
-      </w:tr>
-      <w:tr>
-        <w:trPr>
-          <w:cantSplit/>
-        </w:trPr>
-        <w:tc>
-          <w:tcPr/>
-          <w:p>
-            <w:pPr>
-              <w:pStyle w:val="Compact"/>
-              <w:spacing w:after="0" w:before="0" w:line="240" w:lineRule="auto"/>
-              <w:jc w:val="left"/>
-            </w:pPr>
-            <w:r>
-              <w:rPr>
-                <w:sz w:val="18"/>
-              </w:rPr>
-              <w:t xml:space="preserve">Demanda</w:t>
-            </w:r>
-          </w:p>
-        </w:tc>
-        <w:tc>
-          <w:tcPr/>
-          <w:p>
-            <w:pPr>
-              <w:pStyle w:val="Compact"/>
-              <w:spacing w:after="0" w:before="0" w:line="240" w:lineRule="auto"/>
-              <w:jc w:val="left"/>
-            </w:pPr>
-            <w:r>
-              <w:rPr>
-                <w:sz w:val="18"/>
-              </w:rPr>
-              <w:t xml:space="preserve">La demanda actual es de ≈ 942 mil platos/año y llegaría a 1.120 mil en 2031</w:t>
-            </w:r>
-          </w:p>
-        </w:tc>
-        <w:tc>
-          <w:tcPr/>
-          <w:p>
-            <w:pPr>
-              <w:pStyle w:val="Compact"/>
-              <w:spacing w:after="0" w:before="0" w:line="240" w:lineRule="auto"/>
-              <w:jc w:val="left"/>
-            </w:pPr>
-            <w:r>
-              <w:rPr>
-                <w:sz w:val="18"/>
-              </w:rPr>
-              <w:t xml:space="preserve">Embudo con DANE, Migración Colombia y encuesta</w:t>
-            </w:r>
-          </w:p>
-        </w:tc>
-      </w:tr>
-      <w:tr>
-        <w:trPr>
-          <w:cantSplit/>
-        </w:trPr>
-        <w:tc>
-          <w:tcPr>
-            <w:shd w:val="clear" w:color="auto" w:fill="F5F7FB"/>
-          </w:tcPr>
-          <w:p>
-            <w:pPr>
-              <w:pStyle w:val="Compact"/>
-              <w:spacing w:after="0" w:before="0" w:line="240" w:lineRule="auto"/>
-              <w:jc w:val="left"/>
-            </w:pPr>
-            <w:r>
-              <w:rPr>
-                <w:sz w:val="18"/>
-              </w:rPr>
-              <w:t xml:space="preserve">Oferta</w:t>
-            </w:r>
-          </w:p>
-        </w:tc>
-        <w:tc>
-          <w:tcPr>
-            <w:shd w:val="clear" w:color="auto" w:fill="F5F7FB"/>
-          </w:tcPr>
-          <w:p>
-            <w:pPr>
-              <w:pStyle w:val="Compact"/>
-              <w:spacing w:after="0" w:before="0" w:line="240" w:lineRule="auto"/>
-              <w:jc w:val="left"/>
-            </w:pPr>
-            <w:r>
-              <w:rPr>
-                <w:sz w:val="18"/>
-              </w:rPr>
-              <w:t xml:space="preserve">La oferta crece más despacio (2 % anual)</w:t>
-            </w:r>
-          </w:p>
-        </w:tc>
-        <w:tc>
-          <w:tcPr>
-            <w:shd w:val="clear" w:color="auto" w:fill="F5F7FB"/>
-          </w:tcPr>
-          <w:p>
-            <w:pPr>
-              <w:pStyle w:val="Compact"/>
-              <w:spacing w:after="0" w:before="0" w:line="240" w:lineRule="auto"/>
-              <w:jc w:val="left"/>
-            </w:pPr>
-            <w:r>
-              <w:rPr>
-                <w:sz w:val="18"/>
-              </w:rPr>
-              <w:t xml:space="preserve">ACODRES: alto número de cierres en 2024</w:t>
-            </w:r>
-          </w:p>
-        </w:tc>
-      </w:tr>
-      <w:tr>
-        <w:trPr>
-          <w:cantSplit/>
-        </w:trPr>
-        <w:tc>
-          <w:tcPr/>
-          <w:p>
-            <w:pPr>
-              <w:pStyle w:val="Compact"/>
-              <w:spacing w:after="0" w:before="0" w:line="240" w:lineRule="auto"/>
-              <w:jc w:val="left"/>
-            </w:pPr>
-            <w:r>
-              <w:rPr>
-                <w:sz w:val="18"/>
-              </w:rPr>
-              <w:t xml:space="preserve">Demanda insatisfecha</w:t>
-            </w:r>
-          </w:p>
-        </w:tc>
-        <w:tc>
-          <w:tcPr/>
-          <w:p>
-            <w:pPr>
-              <w:pStyle w:val="Compact"/>
-              <w:spacing w:after="0" w:before="0" w:line="240" w:lineRule="auto"/>
-              <w:jc w:val="left"/>
-            </w:pPr>
-            <w:r>
-              <w:rPr>
-                <w:sz w:val="18"/>
-              </w:rPr>
-              <w:t xml:space="preserve">333 mil platos en 2027 y 425 mil en 2031 (base)</w:t>
-            </w:r>
-          </w:p>
-        </w:tc>
-        <w:tc>
-          <w:tcPr/>
-          <w:p>
-            <w:pPr>
-              <w:pStyle w:val="Compact"/>
-              <w:spacing w:after="0" w:before="0" w:line="240" w:lineRule="auto"/>
-              <w:jc w:val="left"/>
-            </w:pPr>
-            <w:r>
-              <w:rPr>
-                <w:sz w:val="18"/>
-              </w:rPr>
-              <w:t xml:space="preserve">Positiva en los tres escenarios</w:t>
-            </w:r>
-          </w:p>
-        </w:tc>
-      </w:tr>
-      <w:tr>
-        <w:trPr>
-          <w:cantSplit/>
-        </w:trPr>
-        <w:tc>
-          <w:tcPr>
-            <w:shd w:val="clear" w:color="auto" w:fill="F5F7FB"/>
-          </w:tcPr>
-          <w:p>
-            <w:pPr>
-              <w:pStyle w:val="Compact"/>
-              <w:spacing w:after="0" w:before="0" w:line="240" w:lineRule="auto"/>
-              <w:jc w:val="left"/>
-            </w:pPr>
-            <w:r>
-              <w:rPr>
-                <w:sz w:val="18"/>
-              </w:rPr>
-              <w:t xml:space="preserve">Cuota de Kazegami</w:t>
-            </w:r>
-          </w:p>
-        </w:tc>
-        <w:tc>
-          <w:tcPr>
-            <w:shd w:val="clear" w:color="auto" w:fill="F5F7FB"/>
-          </w:tcPr>
-          <w:p>
-            <w:pPr>
-              <w:pStyle w:val="Compact"/>
-              <w:spacing w:after="0" w:before="0" w:line="240" w:lineRule="auto"/>
-              <w:jc w:val="left"/>
-            </w:pPr>
-            <w:r>
-              <w:rPr>
-                <w:sz w:val="18"/>
-              </w:rPr>
-              <w:t xml:space="preserve">8,8 % a 11,0 % de la demanda insatisfecha</w:t>
-            </w:r>
-          </w:p>
-        </w:tc>
-        <w:tc>
-          <w:tcPr>
-            <w:shd w:val="clear" w:color="auto" w:fill="F5F7FB"/>
-          </w:tcPr>
-          <w:p>
-            <w:pPr>
-              <w:pStyle w:val="Compact"/>
-              <w:spacing w:after="0" w:before="0" w:line="240" w:lineRule="auto"/>
-              <w:jc w:val="left"/>
-            </w:pPr>
-            <w:r>
-              <w:rPr>
-                <w:sz w:val="18"/>
-              </w:rPr>
-              <w:t xml:space="preserve">Meta prudente y alcanzable</w:t>
-            </w:r>
-          </w:p>
-        </w:tc>
-      </w:tr>
-      <w:tr>
-        <w:trPr>
-          <w:cantSplit/>
-        </w:trPr>
-        <w:tc>
-          <w:tcPr/>
-          <w:p>
-            <w:pPr>
-              <w:pStyle w:val="Compact"/>
-              <w:spacing w:after="0" w:before="0" w:line="240" w:lineRule="auto"/>
-              <w:jc w:val="left"/>
-            </w:pPr>
-            <w:r>
-              <w:rPr>
-                <w:sz w:val="18"/>
-              </w:rPr>
-              <w:t xml:space="preserve">Precio</w:t>
-            </w:r>
-          </w:p>
-        </w:tc>
-        <w:tc>
-          <w:tcPr/>
-          <w:p>
-            <w:pPr>
-              <w:pStyle w:val="Compact"/>
-              <w:spacing w:after="0" w:before="0" w:line="240" w:lineRule="auto"/>
-              <w:jc w:val="left"/>
-            </w:pPr>
-            <w:r>
-              <w:rPr>
-                <w:sz w:val="18"/>
-              </w:rPr>
-              <w:t xml:space="preserve">Precios de $38.000 a $40.000 por plato, por debajo del promedio real de la competencia; ticket de ≈ $57.000</w:t>
-            </w:r>
-          </w:p>
-        </w:tc>
-        <w:tc>
-          <w:tcPr/>
-          <w:p>
-            <w:pPr>
-              <w:pStyle w:val="Compact"/>
-              <w:spacing w:after="0" w:before="0" w:line="240" w:lineRule="auto"/>
-              <w:jc w:val="left"/>
-            </w:pPr>
-            <w:r>
-              <w:rPr>
-                <w:sz w:val="18"/>
-              </w:rPr>
-              <w:t xml:space="preserve">Por debajo de la competencia $$$ y dentro del rango modal de pago</w:t>
-            </w:r>
-          </w:p>
-        </w:tc>
-      </w:tr>
-      <w:tr>
-        <w:trPr>
-          <w:cantSplit/>
-        </w:trPr>
-        <w:tc>
-          <w:tcPr>
-            <w:shd w:val="clear" w:color="auto" w:fill="F5F7FB"/>
-          </w:tcPr>
-          <w:p>
-            <w:pPr>
-              <w:pStyle w:val="Compact"/>
-              <w:spacing w:after="0" w:before="0" w:line="240" w:lineRule="auto"/>
-              <w:jc w:val="left"/>
-            </w:pPr>
-            <w:r>
-              <w:rPr>
-                <w:sz w:val="18"/>
-              </w:rPr>
-              <w:t xml:space="preserve">Comercialización</w:t>
-            </w:r>
-          </w:p>
-        </w:tc>
-        <w:tc>
-          <w:tcPr>
-            <w:shd w:val="clear" w:color="auto" w:fill="F5F7FB"/>
-          </w:tcPr>
-          <w:p>
-            <w:pPr>
-              <w:pStyle w:val="Compact"/>
-              <w:spacing w:after="0" w:before="0" w:line="240" w:lineRule="auto"/>
-              <w:jc w:val="left"/>
-            </w:pPr>
-            <w:r>
-              <w:rPr>
-                <w:sz w:val="18"/>
-              </w:rPr>
-              <w:t xml:space="preserve">Canal directo; Instagram/TikTok, WhatsApp y alianzas hoteleras</w:t>
-            </w:r>
-          </w:p>
-        </w:tc>
-        <w:tc>
-          <w:tcPr>
-            <w:shd w:val="clear" w:color="auto" w:fill="F5F7FB"/>
-          </w:tcPr>
-          <w:p>
-            <w:pPr>
-              <w:pStyle w:val="Compact"/>
-              <w:spacing w:after="0" w:before="0" w:line="240" w:lineRule="auto"/>
-              <w:jc w:val="left"/>
-            </w:pPr>
-            <w:r>
-              <w:rPr>
-                <w:sz w:val="18"/>
-              </w:rPr>
-              <w:t xml:space="preserve">85,8 % busca en redes; 53,8 % reserva por WhatsApp</w:t>
-            </w:r>
-          </w:p>
-        </w:tc>
-      </w:tr>
-      <w:tr>
-        <w:trPr>
-          <w:cantSplit/>
-        </w:trPr>
-        <w:tc>
-          <w:tcPr/>
-          <w:p>
-            <w:pPr>
-              <w:pStyle w:val="Compact"/>
-              <w:spacing w:after="0" w:before="0" w:line="240" w:lineRule="auto"/>
-              <w:jc w:val="left"/>
-            </w:pPr>
-            <w:r>
-              <w:rPr>
-                <w:sz w:val="18"/>
-              </w:rPr>
-              <w:t xml:space="preserve">Decisión</w:t>
-            </w:r>
-          </w:p>
-        </w:tc>
-        <w:tc>
-          <w:tcPr/>
-          <w:p>
-            <w:pPr>
-              <w:pStyle w:val="Compact"/>
-              <w:spacing w:after="0" w:before="0" w:line="240" w:lineRule="auto"/>
-              <w:jc w:val="left"/>
-            </w:pPr>
-            <w:r>
-              <w:rPr>
-                <w:bCs/>
-                <w:b/>
-                <w:sz w:val="18"/>
-              </w:rPr>
-              <w:t xml:space="preserve">El proyecto es comercialmente viable y pasa al Estudio Técnico</w:t>
-            </w:r>
-          </w:p>
-        </w:tc>
-        <w:tc>
-          <w:tcPr/>
-          <w:p>
-            <w:pPr>
-              <w:pStyle w:val="Compact"/>
-              <w:spacing w:after="0" w:before="0" w:line="240" w:lineRule="auto"/>
-              <w:jc w:val="left"/>
-            </w:pPr>
-            <w:r>
-              <w:rPr>
-                <w:sz w:val="18"/>
-              </w:rPr>
-              <w:t xml:space="preserve">—</w:t>
-            </w:r>
-          </w:p>
-        </w:tc>
-      </w:tr>
-    </w:tbl>
+        <w:t xml:space="preserve">El estudio de mercado muestra que en Cartagena existe un mercado dispuesto a consumir cocina japonesa. El 96,2 % de los encuestados la consume o la probaría y el 82,9 % encuentra atractivo el concepto de Kazegami. Dentro de ese mercado, los Rollos de sushi, el Ramen y la Tempura son los platos que concentran la preferencia, con 61, 40 y 35 menciones, el 77,7 % de las menciones a platos concretos, lo que justifica construir el portafolio exclusivamente con ellos.</w:t>
+      </w:r>
+    </w:p>
+    <w:p>
+      <w:pPr>
+        <w:pStyle w:val="BodyText"/>
+      </w:pPr>
+      <w:r>
+        <w:t xml:space="preserve">La demanda actual de los tres platos se estima en cerca de 942 mil platos al año, calculada con un embudo que combina la población del DANE, el turismo de Migración Colombia y la encuesta, y llegaría a 1.120 mil en 2031 en el escenario base. La oferta, en cambio, crece más despacio (2 % anual), porque el sector de restaurantes tuvo un alto número de cierres en 2024. Por eso la demanda insatisfecha es positiva en los tres escenarios: 333 mil platos en 2027 y 425 mil en 2031 en el escenario base. Kazegami solo necesita atender entre el 6,2 % y el 9,0 % de esa demanda insatisfecha, una meta prudente y alcanzable.</w:t>
+      </w:r>
+    </w:p>
+    <w:p>
+      <w:pPr>
+        <w:pStyle w:val="BodyText"/>
+      </w:pPr>
+      <w:r>
+        <w:t xml:space="preserve">En precio, los platos de Kazegami costarán entre $38.000 y $40.000, por debajo del promedio real de la competencia, que es de $49.684 por rollo y $52.942 por ramen. Así el restaurante responde a la principal queja de los encuestados, los precios altos, y deja un ticket promedio cercano a $57.000 por persona, dentro del rango que la mayoría está dispuesta a pagar. En comercialización, el restaurante usará un canal directo, con promoción en Instagram y TikTok (el 85,8 % busca restaurantes allí), reservas por WhatsApp (53,8 %) y alianzas con hoteles del Centro Histórico.</w:t>
+      </w:r>
+    </w:p>
+    <w:p>
+      <w:pPr>
+        <w:pStyle w:val="BodyText"/>
+      </w:pPr>
+      <w:r>
+        <w:t xml:space="preserve">Con base en estos resultados,</w:t>
+      </w:r>
+      <w:r>
+        <w:t xml:space="preserve"> </w:t>
+      </w:r>
+      <w:r>
+        <w:rPr>
+          <w:bCs/>
+          <w:b/>
+        </w:rPr>
+        <w:t xml:space="preserve">el proyecto es comercialmente viable</w:t>
+      </w:r>
+      <w:r>
+        <w:t xml:space="preserve"> </w:t>
+      </w:r>
+      <w:r>
+        <w:t xml:space="preserve">y pasa al Estudio Técnico, donde se definen la ubicación, el tamaño, los procesos y los costos del restaurante.</w:t>
+      </w:r>
+    </w:p>
     <w:bookmarkEnd w:id="153"/>
     <w:bookmarkStart w:id="154" w:name="referencias"/>
     <w:p>
@@ -39339,14 +39093,14 @@
         <w:pStyle w:val="TableCaption"/>
       </w:pPr>
       <w:r>
-        <w:t xml:space="preserve">Tabla 53. Estado de verificación de los datos usados en el estudio</w:t>
+        <w:t xml:space="preserve">Tabla 52. Estado de verificación de los datos usados en el estudio</w:t>
       </w:r>
     </w:p>
     <w:tbl>
       <w:tblPr>
         <w:tblStyle w:val="Table"/>
         <w:tblLook w:firstRow="1" w:lastRow="0" w:firstColumn="0" w:lastColumn="0" w:noHBand="0" w:noVBand="0" w:val="0020"/>
-        <w:tblCaption w:val="Tabla 53. Estado de verificación de los datos usados en el estudio"/>
+        <w:tblCaption w:val="Tabla 52. Estado de verificación de los datos usados en el estudio"/>
         <w:jc w:val="center"/>
         <w:tblBorders>
           <w:top w:val="single" w:sz="4" w:space="0" w:color="9FB3CF"/>
@@ -40493,7 +40247,7 @@
           <w:color w:val="52514E"/>
           <w:sz w:val="16"/>
         </w:rPr>
-        <w:t xml:space="preserve">Fuente: datos/FUENTES_Y_VERIFICACION.md del repositorio del proyecto.</w:t>
+        <w:t xml:space="preserve">Fuente: Elaboración propia con base en las fuentes citadas en las Referencias.</w:t>
       </w:r>
     </w:p>
     <w:p>
@@ -40537,14 +40291,14 @@
         <w:pStyle w:val="TableCaption"/>
       </w:pPr>
       <w:r>
-        <w:t xml:space="preserve">Tabla 54. Ficha técnica de la encuesta</w:t>
+        <w:t xml:space="preserve">Tabla 53. Ficha técnica de la encuesta</w:t>
       </w:r>
     </w:p>
     <w:tbl>
       <w:tblPr>
         <w:tblStyle w:val="Table"/>
         <w:tblLook w:firstRow="1" w:lastRow="0" w:firstColumn="0" w:lastColumn="0" w:noHBand="0" w:noVBand="0" w:val="0020"/>
-        <w:tblCaption w:val="Tabla 54. Ficha técnica de la encuesta"/>
+        <w:tblCaption w:val="Tabla 53. Ficha técnica de la encuesta"/>
         <w:jc w:val="center"/>
         <w:tblBorders>
           <w:top w:val="single" w:sz="4" w:space="0" w:color="9FB3CF"/>
@@ -40645,7 +40399,7 @@
               <w:rPr>
                 <w:sz w:val="18"/>
               </w:rPr>
-              <w:t xml:space="preserve">Encuesta de mercado – Restaurante Kazegami (Cartagena)</w:t>
+              <w:t xml:space="preserve">Encuesta de mercado - Restaurante Kazegami (Cartagena)</w:t>
             </w:r>
           </w:p>
         </w:tc>
@@ -40885,20 +40639,35 @@
         </w:tc>
       </w:tr>
     </w:tbl>
-    <w:p/>
+    <w:p>
+      <w:pPr>
+        <w:pStyle w:val="BodyText"/>
+      </w:pPr>
+      <w:r>
+        <w:t xml:space="preserve">Como el muestreo fue por conveniencia, los resultados describen bien a los adultos jóvenes residentes en Cartagena, pero no representan con la misma precisión a los turistas ni a las personas mayores. Por eso la demanda se estimó combinando la encuesta con fuentes oficiales.</w:t>
+      </w:r>
+    </w:p>
+    <w:p>
+      <w:pPr>
+        <w:pStyle w:val="BodyText"/>
+      </w:pPr>
+      <w:r>
+        <w:t xml:space="preserve">La tabla relaciona cada pregunta del instrumento con la variable que mide y la sección del documento donde se utiliza.</w:t>
+      </w:r>
+    </w:p>
     <w:p>
       <w:pPr>
         <w:pStyle w:val="TableCaption"/>
       </w:pPr>
       <w:r>
-        <w:t xml:space="preserve">Tabla 55. Preguntas del instrumento y variable que miden</w:t>
+        <w:t xml:space="preserve">Tabla 54. Preguntas del instrumento y variable que miden</w:t>
       </w:r>
     </w:p>
     <w:tbl>
       <w:tblPr>
         <w:tblStyle w:val="Table"/>
         <w:tblLook w:firstRow="1" w:lastRow="0" w:firstColumn="0" w:lastColumn="0" w:noHBand="0" w:noVBand="0" w:val="0020"/>
-        <w:tblCaption w:val="Tabla 55. Preguntas del instrumento y variable que miden"/>
+        <w:tblCaption w:val="Tabla 54. Preguntas del instrumento y variable que miden"/>
         <w:jc w:val="center"/>
         <w:tblBorders>
           <w:top w:val="single" w:sz="4" w:space="0" w:color="9FB3CF"/>
@@ -41525,7 +41294,7 @@
               <w:rPr>
                 <w:sz w:val="18"/>
               </w:rPr>
-              <w:t xml:space="preserve">Alérgenos y variantes (3.5)</w:t>
+              <w:t xml:space="preserve">Alérgenos y variantes del producto (3.6)</w:t>
             </w:r>
           </w:p>
         </w:tc>
@@ -42630,6 +42399,14 @@
         </w:tc>
       </w:tr>
     </w:tbl>
+    <w:p>
+      <w:pPr>
+        <w:pStyle w:val="BodyText"/>
+      </w:pPr>
+      <w:r>
+        <w:t xml:space="preserve">Todas las preguntas de la encuesta se usaron en el estudio, lo que muestra que el instrumento se diseñó en función de la información que necesitaba el análisis.</w:t>
+      </w:r>
+    </w:p>
     <w:p>
       <w:pPr>
         <w:pStyle w:val="CaptionedFigure"/>
@@ -42927,22 +42704,7 @@
         <w:pStyle w:val="BodyText"/>
       </w:pPr>
       <w:r>
-        <w:t xml:space="preserve">Las tablas de frecuencia completas de las 31 columnas y los cruces de variables están en el archivo</w:t>
-      </w:r>
-      <w:r>
-        <w:t xml:space="preserve"> </w:t>
-      </w:r>
-      <w:r>
-        <w:rPr>
-          <w:rStyle w:val="VerbatimChar"/>
-        </w:rPr>
-        <w:t xml:space="preserve">datos/RESUMEN_ENCUESTA.md</w:t>
-      </w:r>
-      <w:r>
-        <w:t xml:space="preserve"> </w:t>
-      </w:r>
-      <w:r>
-        <w:t xml:space="preserve">del repositorio del proyecto.</w:t>
+        <w:t xml:space="preserve">Los resultados de cada pregunta se presentan a lo largo del documento, en las figuras y tablas de las secciones 3 a 7.</w:t>
       </w:r>
     </w:p>
     <w:bookmarkEnd w:id="168"/>

</xml_diff>